<commit_message>
Rewrite lab report for SQLite implementation + add ER diagram
- Replace PostgreSQL GRANT/REVOKE/RLS sections with a description of
  the real SQLite + Java Swing implementation used in SchoolApp.
- Explain why SQLite has no built-in role manager and how the policy
  is enforced at the application level (users table, role-based tabs,
  WHERE / JOIN predicates bound to studentId / teacherId).
- Include real code excerpts from SchoolApp.java.
- Generate ER diagram from db/erd.dot with Graphviz and embed it in
  the report, along with screenshots of all four roles.
</commit_message>
<xml_diff>
--- a/Загоскин_АБД_Лаб_ПолитикаЗащиты.docx
+++ b/Загоскин_АБД_Лаб_ПолитикаЗащиты.docx
@@ -24,6 +24,7 @@
       <w:r>
         <w:rPr>
           <w:rFonts w:ascii="Times New Roman" w:hAnsi="Times New Roman"/>
+          <w:b w:val="0"/>
           <w:sz w:val="24"/>
         </w:rPr>
         <w:t>Федеральное государственное бюджетное</w:t>
@@ -40,6 +41,7 @@
       <w:r>
         <w:rPr>
           <w:rFonts w:ascii="Times New Roman" w:hAnsi="Times New Roman"/>
+          <w:b w:val="0"/>
           <w:sz w:val="24"/>
         </w:rPr>
         <w:t>Институт информационных технологий</w:t>
@@ -70,6 +72,7 @@
       <w:r>
         <w:rPr>
           <w:rFonts w:ascii="Times New Roman" w:hAnsi="Times New Roman"/>
+          <w:b w:val="0"/>
           <w:sz w:val="28"/>
         </w:rPr>
         <w:t>по дисциплине «Администрирование баз данных»</w:t>
@@ -88,7 +91,6 @@
         <w:t>на тему «Применение политики защиты»</w:t>
       </w:r>
     </w:p>
-    <w:p/>
     <w:p/>
     <w:p/>
     <w:p/>
@@ -133,6 +135,7 @@
       <w:r>
         <w:rPr>
           <w:rFonts w:ascii="Times New Roman" w:hAnsi="Times New Roman"/>
+          <w:b w:val="0"/>
           <w:sz w:val="28"/>
         </w:rPr>
         <w:t>Череповец, 2026</w:t>
@@ -209,7 +212,7 @@
           <w:rFonts w:ascii="Times New Roman" w:hAnsi="Times New Roman"/>
           <w:sz w:val="28"/>
         </w:rPr>
-        <w:t>учащийся — успеваемость любого ученика по любому предмету, своя успеваемость по всем предметам;</w:t>
+        <w:t>учащийся — успеваемость любого ученика, своя успеваемость по любому предмету;</w:t>
       </w:r>
     </w:p>
     <w:p>
@@ -238,7 +241,7 @@
           <w:i w:val="0"/>
           <w:sz w:val="28"/>
         </w:rPr>
-        <w:t>Необходимо продумать распределение прав «по ширине» (на уровне таблиц и полей) и «по записям» (горизонтальная фильтрация строк), а затем реализовать политику защиты средствами СУБД.</w:t>
+        <w:t>Необходимо продумать распределение прав «по ширине» (на уровне таблиц и полей) и «по записям» (горизонтальная фильтрация строк), после чего реализовать политику защиты в программном продукте.</w:t>
       </w:r>
     </w:p>
     <w:p>
@@ -252,7 +255,7 @@
           <w:b/>
           <w:sz w:val="32"/>
         </w:rPr>
-        <w:t>2. Логическая модель базы данных</w:t>
+        <w:t>2. Выбор средств реализации</w:t>
       </w:r>
     </w:p>
     <w:p>
@@ -268,22 +271,83 @@
           <w:i w:val="0"/>
           <w:sz w:val="28"/>
         </w:rPr>
-        <w:t>Для решения поставленной задачи спроектирована реляционная база данных «School», содержащая сведения об учениках, родителях, учителях, изучаемых предметах, оценках и медицинских осмотрах. Перечень основных таблиц приведён в таблице 1.</w:t>
+        <w:t>В качестве СУБД выбран SQLite — встраиваемая реляционная база данных, не требующая отдельного серверного процесса и идеально подходящая для учебного приложения и десктопных решений. Файл базы data/school.db хранится локально и обрабатывается через JDBC-драйвер sqlite-jdbc версии 3.46.1.3.</w:t>
       </w:r>
     </w:p>
     <w:p>
       <w:pPr>
         <w:spacing w:line="360" w:lineRule="auto" w:after="0"/>
+        <w:ind w:firstLine="709"/>
+        <w:jc w:val="both"/>
+      </w:pPr>
+      <w:r>
+        <w:rPr>
+          <w:rFonts w:ascii="Times New Roman" w:hAnsi="Times New Roman"/>
+          <w:b w:val="0"/>
+          <w:i w:val="0"/>
+          <w:sz w:val="28"/>
+        </w:rPr>
+        <w:t>Клиентское приложение разработано на языке Java (JDK 21) с использованием библиотеки графического интерфейса Swing. Такой выбор обусловлен кроссплатформенностью (приложение работает одинаково на Windows, macOS и Linux без перекомпиляции), встроенной поддержкой JDBC и отсутствием необходимости в отдельном runtime. Исходный код проекта находится в каталоге SchoolApp репозитория.</w:t>
+      </w:r>
+    </w:p>
+    <w:p>
+      <w:pPr>
+        <w:spacing w:line="360" w:lineRule="auto" w:after="0"/>
+        <w:ind w:firstLine="709"/>
+        <w:jc w:val="both"/>
+      </w:pPr>
+      <w:r>
+        <w:rPr>
+          <w:rFonts w:ascii="Times New Roman" w:hAnsi="Times New Roman"/>
+          <w:b w:val="0"/>
+          <w:i w:val="0"/>
+          <w:sz w:val="28"/>
+        </w:rPr>
+        <w:t>Поскольку SQLite, в отличие от «серверных» СУБД (PostgreSQL, Oracle), не имеет собственного менеджера ролей и привилегий (команды CREATE ROLE, GRANT, REVOKE в нём отсутствуют), политика защиты реализована на уровне приложения. Пользователь аутентифицируется через таблицу users, а дальнейшие SQL-запросы формируются таким образом, чтобы возвращать только разрешённые данные — в зависимости от роли текущего пользователя.</w:t>
+      </w:r>
+    </w:p>
+    <w:p>
+      <w:pPr>
+        <w:spacing w:before="240" w:after="120"/>
         <w:jc w:val="center"/>
       </w:pPr>
       <w:r>
         <w:rPr>
           <w:rFonts w:ascii="Times New Roman" w:hAnsi="Times New Roman"/>
           <w:b/>
+          <w:sz w:val="32"/>
+        </w:rPr>
+        <w:t>3. Логическая модель базы данных</w:t>
+      </w:r>
+    </w:p>
+    <w:p>
+      <w:pPr>
+        <w:spacing w:line="360" w:lineRule="auto" w:after="0"/>
+        <w:ind w:firstLine="709"/>
+        <w:jc w:val="both"/>
+      </w:pPr>
+      <w:r>
+        <w:rPr>
+          <w:rFonts w:ascii="Times New Roman" w:hAnsi="Times New Roman"/>
+          <w:b w:val="0"/>
           <w:i w:val="0"/>
           <w:sz w:val="28"/>
         </w:rPr>
-        <w:t>Таблица 1 — Состав таблиц БД «School»</w:t>
+        <w:t>База данных School состоит из восьми таблиц, отражающих основные сущности предметной области: ученики, их родители и медицинские карты, классы и учителя, изучаемые предметы, журнал оценок и учётные записи пользователей системы. Состав таблиц приведён в таблице 1, а ER-диаграмма — на рисунке 1.</w:t>
+      </w:r>
+    </w:p>
+    <w:p>
+      <w:pPr>
+        <w:spacing w:after="120"/>
+        <w:jc w:val="center"/>
+      </w:pPr>
+      <w:r>
+        <w:rPr>
+          <w:rFonts w:ascii="Times New Roman" w:hAnsi="Times New Roman"/>
+          <w:i/>
+          <w:sz w:val="24"/>
+        </w:rPr>
+        <w:t>Таблица 1 — Состав таблиц БД School</w:t>
       </w:r>
     </w:p>
     <w:tbl>
@@ -399,6 +463,314 @@
                 <w:rFonts w:ascii="Times New Roman" w:hAnsi="Times New Roman"/>
                 <w:sz w:val="24"/>
               </w:rPr>
+              <w:t>users</w:t>
+            </w:r>
+          </w:p>
+        </w:tc>
+        <w:tc>
+          <w:tcPr>
+            <w:tcW w:type="dxa" w:w="3230"/>
+            <w:tcBorders>
+              <w:top w:val="single" w:sz="4" w:color="000000"/>
+              <w:left w:val="single" w:sz="4" w:color="000000"/>
+              <w:bottom w:val="single" w:sz="4" w:color="000000"/>
+              <w:right w:val="single" w:sz="4" w:color="000000"/>
+            </w:tcBorders>
+            <w:vAlign w:val="center"/>
+          </w:tcPr>
+          <w:p>
+            <w:pPr>
+              <w:jc w:val="left"/>
+            </w:pPr>
+            <w:r/>
+            <w:r>
+              <w:rPr>
+                <w:rFonts w:ascii="Times New Roman" w:hAnsi="Times New Roman"/>
+                <w:sz w:val="24"/>
+              </w:rPr>
+              <w:t>Учётные записи пользователей</w:t>
+            </w:r>
+          </w:p>
+        </w:tc>
+        <w:tc>
+          <w:tcPr>
+            <w:tcW w:type="dxa" w:w="3230"/>
+            <w:tcBorders>
+              <w:top w:val="single" w:sz="4" w:color="000000"/>
+              <w:left w:val="single" w:sz="4" w:color="000000"/>
+              <w:bottom w:val="single" w:sz="4" w:color="000000"/>
+              <w:right w:val="single" w:sz="4" w:color="000000"/>
+            </w:tcBorders>
+            <w:vAlign w:val="center"/>
+          </w:tcPr>
+          <w:p>
+            <w:pPr>
+              <w:jc w:val="left"/>
+            </w:pPr>
+            <w:r/>
+            <w:r>
+              <w:rPr>
+                <w:rFonts w:ascii="Times New Roman" w:hAnsi="Times New Roman"/>
+                <w:sz w:val="24"/>
+              </w:rPr>
+              <w:t>login (PK), password, role, full_name</w:t>
+            </w:r>
+          </w:p>
+        </w:tc>
+      </w:tr>
+      <w:tr>
+        <w:tc>
+          <w:tcPr>
+            <w:tcW w:type="dxa" w:w="3230"/>
+            <w:tcBorders>
+              <w:top w:val="single" w:sz="4" w:color="000000"/>
+              <w:left w:val="single" w:sz="4" w:color="000000"/>
+              <w:bottom w:val="single" w:sz="4" w:color="000000"/>
+              <w:right w:val="single" w:sz="4" w:color="000000"/>
+            </w:tcBorders>
+            <w:vAlign w:val="center"/>
+          </w:tcPr>
+          <w:p>
+            <w:pPr>
+              <w:jc w:val="left"/>
+            </w:pPr>
+            <w:r/>
+            <w:r>
+              <w:rPr>
+                <w:rFonts w:ascii="Times New Roman" w:hAnsi="Times New Roman"/>
+                <w:sz w:val="24"/>
+              </w:rPr>
+              <w:t>teachers</w:t>
+            </w:r>
+          </w:p>
+        </w:tc>
+        <w:tc>
+          <w:tcPr>
+            <w:tcW w:type="dxa" w:w="3230"/>
+            <w:tcBorders>
+              <w:top w:val="single" w:sz="4" w:color="000000"/>
+              <w:left w:val="single" w:sz="4" w:color="000000"/>
+              <w:bottom w:val="single" w:sz="4" w:color="000000"/>
+              <w:right w:val="single" w:sz="4" w:color="000000"/>
+            </w:tcBorders>
+            <w:vAlign w:val="center"/>
+          </w:tcPr>
+          <w:p>
+            <w:pPr>
+              <w:jc w:val="left"/>
+            </w:pPr>
+            <w:r/>
+            <w:r>
+              <w:rPr>
+                <w:rFonts w:ascii="Times New Roman" w:hAnsi="Times New Roman"/>
+                <w:sz w:val="24"/>
+              </w:rPr>
+              <w:t>Сведения об учителях</w:t>
+            </w:r>
+          </w:p>
+        </w:tc>
+        <w:tc>
+          <w:tcPr>
+            <w:tcW w:type="dxa" w:w="3230"/>
+            <w:tcBorders>
+              <w:top w:val="single" w:sz="4" w:color="000000"/>
+              <w:left w:val="single" w:sz="4" w:color="000000"/>
+              <w:bottom w:val="single" w:sz="4" w:color="000000"/>
+              <w:right w:val="single" w:sz="4" w:color="000000"/>
+            </w:tcBorders>
+            <w:vAlign w:val="center"/>
+          </w:tcPr>
+          <w:p>
+            <w:pPr>
+              <w:jc w:val="left"/>
+            </w:pPr>
+            <w:r/>
+            <w:r>
+              <w:rPr>
+                <w:rFonts w:ascii="Times New Roman" w:hAnsi="Times New Roman"/>
+                <w:sz w:val="24"/>
+              </w:rPr>
+              <w:t>id (PK), login, last_name, first_name</w:t>
+            </w:r>
+          </w:p>
+        </w:tc>
+      </w:tr>
+      <w:tr>
+        <w:tc>
+          <w:tcPr>
+            <w:tcW w:type="dxa" w:w="3230"/>
+            <w:tcBorders>
+              <w:top w:val="single" w:sz="4" w:color="000000"/>
+              <w:left w:val="single" w:sz="4" w:color="000000"/>
+              <w:bottom w:val="single" w:sz="4" w:color="000000"/>
+              <w:right w:val="single" w:sz="4" w:color="000000"/>
+            </w:tcBorders>
+            <w:vAlign w:val="center"/>
+          </w:tcPr>
+          <w:p>
+            <w:pPr>
+              <w:jc w:val="left"/>
+            </w:pPr>
+            <w:r/>
+            <w:r>
+              <w:rPr>
+                <w:rFonts w:ascii="Times New Roman" w:hAnsi="Times New Roman"/>
+                <w:sz w:val="24"/>
+              </w:rPr>
+              <w:t>classes</w:t>
+            </w:r>
+          </w:p>
+        </w:tc>
+        <w:tc>
+          <w:tcPr>
+            <w:tcW w:type="dxa" w:w="3230"/>
+            <w:tcBorders>
+              <w:top w:val="single" w:sz="4" w:color="000000"/>
+              <w:left w:val="single" w:sz="4" w:color="000000"/>
+              <w:bottom w:val="single" w:sz="4" w:color="000000"/>
+              <w:right w:val="single" w:sz="4" w:color="000000"/>
+            </w:tcBorders>
+            <w:vAlign w:val="center"/>
+          </w:tcPr>
+          <w:p>
+            <w:pPr>
+              <w:jc w:val="left"/>
+            </w:pPr>
+            <w:r/>
+            <w:r>
+              <w:rPr>
+                <w:rFonts w:ascii="Times New Roman" w:hAnsi="Times New Roman"/>
+                <w:sz w:val="24"/>
+              </w:rPr>
+              <w:t>Учебные классы</w:t>
+            </w:r>
+          </w:p>
+        </w:tc>
+        <w:tc>
+          <w:tcPr>
+            <w:tcW w:type="dxa" w:w="3230"/>
+            <w:tcBorders>
+              <w:top w:val="single" w:sz="4" w:color="000000"/>
+              <w:left w:val="single" w:sz="4" w:color="000000"/>
+              <w:bottom w:val="single" w:sz="4" w:color="000000"/>
+              <w:right w:val="single" w:sz="4" w:color="000000"/>
+            </w:tcBorders>
+            <w:vAlign w:val="center"/>
+          </w:tcPr>
+          <w:p>
+            <w:pPr>
+              <w:jc w:val="left"/>
+            </w:pPr>
+            <w:r/>
+            <w:r>
+              <w:rPr>
+                <w:rFonts w:ascii="Times New Roman" w:hAnsi="Times New Roman"/>
+                <w:sz w:val="24"/>
+              </w:rPr>
+              <w:t>id (PK), name, teacher_id</w:t>
+            </w:r>
+          </w:p>
+        </w:tc>
+      </w:tr>
+      <w:tr>
+        <w:tc>
+          <w:tcPr>
+            <w:tcW w:type="dxa" w:w="3230"/>
+            <w:tcBorders>
+              <w:top w:val="single" w:sz="4" w:color="000000"/>
+              <w:left w:val="single" w:sz="4" w:color="000000"/>
+              <w:bottom w:val="single" w:sz="4" w:color="000000"/>
+              <w:right w:val="single" w:sz="4" w:color="000000"/>
+            </w:tcBorders>
+            <w:vAlign w:val="center"/>
+          </w:tcPr>
+          <w:p>
+            <w:pPr>
+              <w:jc w:val="left"/>
+            </w:pPr>
+            <w:r/>
+            <w:r>
+              <w:rPr>
+                <w:rFonts w:ascii="Times New Roman" w:hAnsi="Times New Roman"/>
+                <w:sz w:val="24"/>
+              </w:rPr>
+              <w:t>subjects</w:t>
+            </w:r>
+          </w:p>
+        </w:tc>
+        <w:tc>
+          <w:tcPr>
+            <w:tcW w:type="dxa" w:w="3230"/>
+            <w:tcBorders>
+              <w:top w:val="single" w:sz="4" w:color="000000"/>
+              <w:left w:val="single" w:sz="4" w:color="000000"/>
+              <w:bottom w:val="single" w:sz="4" w:color="000000"/>
+              <w:right w:val="single" w:sz="4" w:color="000000"/>
+            </w:tcBorders>
+            <w:vAlign w:val="center"/>
+          </w:tcPr>
+          <w:p>
+            <w:pPr>
+              <w:jc w:val="left"/>
+            </w:pPr>
+            <w:r/>
+            <w:r>
+              <w:rPr>
+                <w:rFonts w:ascii="Times New Roman" w:hAnsi="Times New Roman"/>
+                <w:sz w:val="24"/>
+              </w:rPr>
+              <w:t>Перечень предметов</w:t>
+            </w:r>
+          </w:p>
+        </w:tc>
+        <w:tc>
+          <w:tcPr>
+            <w:tcW w:type="dxa" w:w="3230"/>
+            <w:tcBorders>
+              <w:top w:val="single" w:sz="4" w:color="000000"/>
+              <w:left w:val="single" w:sz="4" w:color="000000"/>
+              <w:bottom w:val="single" w:sz="4" w:color="000000"/>
+              <w:right w:val="single" w:sz="4" w:color="000000"/>
+            </w:tcBorders>
+            <w:vAlign w:val="center"/>
+          </w:tcPr>
+          <w:p>
+            <w:pPr>
+              <w:jc w:val="left"/>
+            </w:pPr>
+            <w:r/>
+            <w:r>
+              <w:rPr>
+                <w:rFonts w:ascii="Times New Roman" w:hAnsi="Times New Roman"/>
+                <w:sz w:val="24"/>
+              </w:rPr>
+              <w:t>id (PK), name</w:t>
+            </w:r>
+          </w:p>
+        </w:tc>
+      </w:tr>
+      <w:tr>
+        <w:tc>
+          <w:tcPr>
+            <w:tcW w:type="dxa" w:w="3230"/>
+            <w:tcBorders>
+              <w:top w:val="single" w:sz="4" w:color="000000"/>
+              <w:left w:val="single" w:sz="4" w:color="000000"/>
+              <w:bottom w:val="single" w:sz="4" w:color="000000"/>
+              <w:right w:val="single" w:sz="4" w:color="000000"/>
+            </w:tcBorders>
+            <w:vAlign w:val="center"/>
+          </w:tcPr>
+          <w:p>
+            <w:pPr>
+              <w:jc w:val="left"/>
+            </w:pPr>
+            <w:r/>
+            <w:r>
+              <w:rPr>
+                <w:rFonts w:ascii="Times New Roman" w:hAnsi="Times New Roman"/>
+                <w:sz w:val="24"/>
+              </w:rPr>
               <w:t>students</w:t>
             </w:r>
           </w:p>
@@ -449,7 +821,7 @@
                 <w:rFonts w:ascii="Times New Roman" w:hAnsi="Times New Roman"/>
                 <w:sz w:val="24"/>
               </w:rPr>
-              <w:t>id, last_name, first_name, class_id, login</w:t>
+              <w:t>id (PK), login, class_id, last_name, first_name</w:t>
             </w:r>
           </w:p>
         </w:tc>
@@ -526,238 +898,7 @@
                 <w:rFonts w:ascii="Times New Roman" w:hAnsi="Times New Roman"/>
                 <w:sz w:val="24"/>
               </w:rPr>
-              <w:t>id, student_id, last_name, first_name, phone</w:t>
-            </w:r>
-          </w:p>
-        </w:tc>
-      </w:tr>
-      <w:tr>
-        <w:tc>
-          <w:tcPr>
-            <w:tcW w:type="dxa" w:w="3230"/>
-            <w:tcBorders>
-              <w:top w:val="single" w:sz="4" w:color="000000"/>
-              <w:left w:val="single" w:sz="4" w:color="000000"/>
-              <w:bottom w:val="single" w:sz="4" w:color="000000"/>
-              <w:right w:val="single" w:sz="4" w:color="000000"/>
-            </w:tcBorders>
-            <w:vAlign w:val="center"/>
-          </w:tcPr>
-          <w:p>
-            <w:pPr>
-              <w:jc w:val="left"/>
-            </w:pPr>
-            <w:r/>
-            <w:r>
-              <w:rPr>
-                <w:rFonts w:ascii="Times New Roman" w:hAnsi="Times New Roman"/>
-                <w:sz w:val="24"/>
-              </w:rPr>
-              <w:t>teachers</w:t>
-            </w:r>
-          </w:p>
-        </w:tc>
-        <w:tc>
-          <w:tcPr>
-            <w:tcW w:type="dxa" w:w="3230"/>
-            <w:tcBorders>
-              <w:top w:val="single" w:sz="4" w:color="000000"/>
-              <w:left w:val="single" w:sz="4" w:color="000000"/>
-              <w:bottom w:val="single" w:sz="4" w:color="000000"/>
-              <w:right w:val="single" w:sz="4" w:color="000000"/>
-            </w:tcBorders>
-            <w:vAlign w:val="center"/>
-          </w:tcPr>
-          <w:p>
-            <w:pPr>
-              <w:jc w:val="left"/>
-            </w:pPr>
-            <w:r/>
-            <w:r>
-              <w:rPr>
-                <w:rFonts w:ascii="Times New Roman" w:hAnsi="Times New Roman"/>
-                <w:sz w:val="24"/>
-              </w:rPr>
-              <w:t>Сведения об учителях</w:t>
-            </w:r>
-          </w:p>
-        </w:tc>
-        <w:tc>
-          <w:tcPr>
-            <w:tcW w:type="dxa" w:w="3230"/>
-            <w:tcBorders>
-              <w:top w:val="single" w:sz="4" w:color="000000"/>
-              <w:left w:val="single" w:sz="4" w:color="000000"/>
-              <w:bottom w:val="single" w:sz="4" w:color="000000"/>
-              <w:right w:val="single" w:sz="4" w:color="000000"/>
-            </w:tcBorders>
-            <w:vAlign w:val="center"/>
-          </w:tcPr>
-          <w:p>
-            <w:pPr>
-              <w:jc w:val="left"/>
-            </w:pPr>
-            <w:r/>
-            <w:r>
-              <w:rPr>
-                <w:rFonts w:ascii="Times New Roman" w:hAnsi="Times New Roman"/>
-                <w:sz w:val="24"/>
-              </w:rPr>
-              <w:t>id, last_name, first_name, login</w:t>
-            </w:r>
-          </w:p>
-        </w:tc>
-      </w:tr>
-      <w:tr>
-        <w:tc>
-          <w:tcPr>
-            <w:tcW w:type="dxa" w:w="3230"/>
-            <w:tcBorders>
-              <w:top w:val="single" w:sz="4" w:color="000000"/>
-              <w:left w:val="single" w:sz="4" w:color="000000"/>
-              <w:bottom w:val="single" w:sz="4" w:color="000000"/>
-              <w:right w:val="single" w:sz="4" w:color="000000"/>
-            </w:tcBorders>
-            <w:vAlign w:val="center"/>
-          </w:tcPr>
-          <w:p>
-            <w:pPr>
-              <w:jc w:val="left"/>
-            </w:pPr>
-            <w:r/>
-            <w:r>
-              <w:rPr>
-                <w:rFonts w:ascii="Times New Roman" w:hAnsi="Times New Roman"/>
-                <w:sz w:val="24"/>
-              </w:rPr>
-              <w:t>subjects</w:t>
-            </w:r>
-          </w:p>
-        </w:tc>
-        <w:tc>
-          <w:tcPr>
-            <w:tcW w:type="dxa" w:w="3230"/>
-            <w:tcBorders>
-              <w:top w:val="single" w:sz="4" w:color="000000"/>
-              <w:left w:val="single" w:sz="4" w:color="000000"/>
-              <w:bottom w:val="single" w:sz="4" w:color="000000"/>
-              <w:right w:val="single" w:sz="4" w:color="000000"/>
-            </w:tcBorders>
-            <w:vAlign w:val="center"/>
-          </w:tcPr>
-          <w:p>
-            <w:pPr>
-              <w:jc w:val="left"/>
-            </w:pPr>
-            <w:r/>
-            <w:r>
-              <w:rPr>
-                <w:rFonts w:ascii="Times New Roman" w:hAnsi="Times New Roman"/>
-                <w:sz w:val="24"/>
-              </w:rPr>
-              <w:t>Перечень предметов</w:t>
-            </w:r>
-          </w:p>
-        </w:tc>
-        <w:tc>
-          <w:tcPr>
-            <w:tcW w:type="dxa" w:w="3230"/>
-            <w:tcBorders>
-              <w:top w:val="single" w:sz="4" w:color="000000"/>
-              <w:left w:val="single" w:sz="4" w:color="000000"/>
-              <w:bottom w:val="single" w:sz="4" w:color="000000"/>
-              <w:right w:val="single" w:sz="4" w:color="000000"/>
-            </w:tcBorders>
-            <w:vAlign w:val="center"/>
-          </w:tcPr>
-          <w:p>
-            <w:pPr>
-              <w:jc w:val="left"/>
-            </w:pPr>
-            <w:r/>
-            <w:r>
-              <w:rPr>
-                <w:rFonts w:ascii="Times New Roman" w:hAnsi="Times New Roman"/>
-                <w:sz w:val="24"/>
-              </w:rPr>
-              <w:t>id, name</w:t>
-            </w:r>
-          </w:p>
-        </w:tc>
-      </w:tr>
-      <w:tr>
-        <w:tc>
-          <w:tcPr>
-            <w:tcW w:type="dxa" w:w="3230"/>
-            <w:tcBorders>
-              <w:top w:val="single" w:sz="4" w:color="000000"/>
-              <w:left w:val="single" w:sz="4" w:color="000000"/>
-              <w:bottom w:val="single" w:sz="4" w:color="000000"/>
-              <w:right w:val="single" w:sz="4" w:color="000000"/>
-            </w:tcBorders>
-            <w:vAlign w:val="center"/>
-          </w:tcPr>
-          <w:p>
-            <w:pPr>
-              <w:jc w:val="left"/>
-            </w:pPr>
-            <w:r/>
-            <w:r>
-              <w:rPr>
-                <w:rFonts w:ascii="Times New Roman" w:hAnsi="Times New Roman"/>
-                <w:sz w:val="24"/>
-              </w:rPr>
-              <w:t>classes</w:t>
-            </w:r>
-          </w:p>
-        </w:tc>
-        <w:tc>
-          <w:tcPr>
-            <w:tcW w:type="dxa" w:w="3230"/>
-            <w:tcBorders>
-              <w:top w:val="single" w:sz="4" w:color="000000"/>
-              <w:left w:val="single" w:sz="4" w:color="000000"/>
-              <w:bottom w:val="single" w:sz="4" w:color="000000"/>
-              <w:right w:val="single" w:sz="4" w:color="000000"/>
-            </w:tcBorders>
-            <w:vAlign w:val="center"/>
-          </w:tcPr>
-          <w:p>
-            <w:pPr>
-              <w:jc w:val="left"/>
-            </w:pPr>
-            <w:r/>
-            <w:r>
-              <w:rPr>
-                <w:rFonts w:ascii="Times New Roman" w:hAnsi="Times New Roman"/>
-                <w:sz w:val="24"/>
-              </w:rPr>
-              <w:t>Учебные классы</w:t>
-            </w:r>
-          </w:p>
-        </w:tc>
-        <w:tc>
-          <w:tcPr>
-            <w:tcW w:type="dxa" w:w="3230"/>
-            <w:tcBorders>
-              <w:top w:val="single" w:sz="4" w:color="000000"/>
-              <w:left w:val="single" w:sz="4" w:color="000000"/>
-              <w:bottom w:val="single" w:sz="4" w:color="000000"/>
-              <w:right w:val="single" w:sz="4" w:color="000000"/>
-            </w:tcBorders>
-            <w:vAlign w:val="center"/>
-          </w:tcPr>
-          <w:p>
-            <w:pPr>
-              <w:jc w:val="left"/>
-            </w:pPr>
-            <w:r/>
-            <w:r>
-              <w:rPr>
-                <w:rFonts w:ascii="Times New Roman" w:hAnsi="Times New Roman"/>
-                <w:sz w:val="24"/>
-              </w:rPr>
-              <w:t>id, name, teacher_id</w:t>
+              <w:t>id (PK), student_id, last_name, first_name, phone</w:t>
             </w:r>
           </w:p>
         </w:tc>
@@ -834,7 +975,7 @@
                 <w:rFonts w:ascii="Times New Roman" w:hAnsi="Times New Roman"/>
                 <w:sz w:val="24"/>
               </w:rPr>
-              <w:t>id, student_id, subject_id, grade, date</w:t>
+              <w:t>id (PK), student_id, subject_id, grade, date</w:t>
             </w:r>
           </w:p>
         </w:tc>
@@ -911,84 +1052,7 @@
                 <w:rFonts w:ascii="Times New Roman" w:hAnsi="Times New Roman"/>
                 <w:sz w:val="24"/>
               </w:rPr>
-              <w:t>id, student_id, diagnosis, date</w:t>
-            </w:r>
-          </w:p>
-        </w:tc>
-      </w:tr>
-      <w:tr>
-        <w:tc>
-          <w:tcPr>
-            <w:tcW w:type="dxa" w:w="3230"/>
-            <w:tcBorders>
-              <w:top w:val="single" w:sz="4" w:color="000000"/>
-              <w:left w:val="single" w:sz="4" w:color="000000"/>
-              <w:bottom w:val="single" w:sz="4" w:color="000000"/>
-              <w:right w:val="single" w:sz="4" w:color="000000"/>
-            </w:tcBorders>
-            <w:vAlign w:val="center"/>
-          </w:tcPr>
-          <w:p>
-            <w:pPr>
-              <w:jc w:val="left"/>
-            </w:pPr>
-            <w:r/>
-            <w:r>
-              <w:rPr>
-                <w:rFonts w:ascii="Times New Roman" w:hAnsi="Times New Roman"/>
-                <w:sz w:val="24"/>
-              </w:rPr>
-              <w:t>users</w:t>
-            </w:r>
-          </w:p>
-        </w:tc>
-        <w:tc>
-          <w:tcPr>
-            <w:tcW w:type="dxa" w:w="3230"/>
-            <w:tcBorders>
-              <w:top w:val="single" w:sz="4" w:color="000000"/>
-              <w:left w:val="single" w:sz="4" w:color="000000"/>
-              <w:bottom w:val="single" w:sz="4" w:color="000000"/>
-              <w:right w:val="single" w:sz="4" w:color="000000"/>
-            </w:tcBorders>
-            <w:vAlign w:val="center"/>
-          </w:tcPr>
-          <w:p>
-            <w:pPr>
-              <w:jc w:val="left"/>
-            </w:pPr>
-            <w:r/>
-            <w:r>
-              <w:rPr>
-                <w:rFonts w:ascii="Times New Roman" w:hAnsi="Times New Roman"/>
-                <w:sz w:val="24"/>
-              </w:rPr>
-              <w:t>Учётные записи пользователей</w:t>
-            </w:r>
-          </w:p>
-        </w:tc>
-        <w:tc>
-          <w:tcPr>
-            <w:tcW w:type="dxa" w:w="3230"/>
-            <w:tcBorders>
-              <w:top w:val="single" w:sz="4" w:color="000000"/>
-              <w:left w:val="single" w:sz="4" w:color="000000"/>
-              <w:bottom w:val="single" w:sz="4" w:color="000000"/>
-              <w:right w:val="single" w:sz="4" w:color="000000"/>
-            </w:tcBorders>
-            <w:vAlign w:val="center"/>
-          </w:tcPr>
-          <w:p>
-            <w:pPr>
-              <w:jc w:val="left"/>
-            </w:pPr>
-            <w:r/>
-            <w:r>
-              <w:rPr>
-                <w:rFonts w:ascii="Times New Roman" w:hAnsi="Times New Roman"/>
-                <w:sz w:val="24"/>
-              </w:rPr>
-              <w:t>login, role</w:t>
+              <w:t>id (PK), student_id, diagnosis, date</w:t>
             </w:r>
           </w:p>
         </w:tc>
@@ -996,16 +1060,71 @@
     </w:tbl>
     <w:p>
       <w:pPr>
-        <w:spacing w:before="240" w:after="120"/>
+        <w:spacing w:line="360" w:lineRule="auto" w:after="0"/>
+        <w:ind w:firstLine="709"/>
+        <w:jc w:val="both"/>
+      </w:pPr>
+      <w:r>
+        <w:rPr>
+          <w:rFonts w:ascii="Times New Roman" w:hAnsi="Times New Roman"/>
+          <w:b w:val="0"/>
+          <w:i w:val="0"/>
+          <w:sz w:val="28"/>
+        </w:rPr>
+      </w:r>
+    </w:p>
+    <w:p>
+      <w:pPr>
+        <w:spacing w:before="120" w:after="0"/>
+        <w:jc w:val="center"/>
+      </w:pPr>
+      <w:r>
+        <w:drawing>
+          <wp:inline xmlns:a="http://schemas.openxmlformats.org/drawingml/2006/main" xmlns:pic="http://schemas.openxmlformats.org/drawingml/2006/picture">
+            <wp:extent cx="5760000" cy="2632674"/>
+            <wp:docPr id="1" name="Picture 1"/>
+            <wp:cNvGraphicFramePr>
+              <a:graphicFrameLocks noChangeAspect="1"/>
+            </wp:cNvGraphicFramePr>
+            <a:graphic>
+              <a:graphicData uri="http://schemas.openxmlformats.org/drawingml/2006/picture">
+                <pic:pic>
+                  <pic:nvPicPr>
+                    <pic:cNvPr id="0" name="erd.png"/>
+                    <pic:cNvPicPr/>
+                  </pic:nvPicPr>
+                  <pic:blipFill>
+                    <a:blip r:embed="rId9"/>
+                    <a:stretch>
+                      <a:fillRect/>
+                    </a:stretch>
+                  </pic:blipFill>
+                  <pic:spPr>
+                    <a:xfrm>
+                      <a:off x="0" y="0"/>
+                      <a:ext cx="5760000" cy="2632674"/>
+                    </a:xfrm>
+                    <a:prstGeom prst="rect"/>
+                  </pic:spPr>
+                </pic:pic>
+              </a:graphicData>
+            </a:graphic>
+          </wp:inline>
+        </w:drawing>
+      </w:r>
+    </w:p>
+    <w:p>
+      <w:pPr>
+        <w:spacing w:after="120"/>
         <w:jc w:val="center"/>
       </w:pPr>
       <w:r>
         <w:rPr>
           <w:rFonts w:ascii="Times New Roman" w:hAnsi="Times New Roman"/>
-          <w:b/>
-          <w:sz w:val="32"/>
+          <w:i/>
+          <w:sz w:val="24"/>
         </w:rPr>
-        <w:t>3. Анализ ролей и распределение прав</w:t>
+        <w:t>Рисунок 1 — ER-диаграмма БД School (нотация «вороньи лапки»)</w:t>
       </w:r>
     </w:p>
     <w:p>
@@ -1021,20 +1140,49 @@
           <w:i w:val="0"/>
           <w:sz w:val="28"/>
         </w:rPr>
-        <w:t>На основе требований заказчика выделены четыре роли пользователей. В таблице 2 приведено распределение прав «по ширине» — какие таблицы и поля доступны каждой роли и с каким уровнем доступа (R — чтение, W — запись/изменение, — — нет доступа).</w:t>
+        <w:t>Таблица users связана с teachers и students по общему полю login, что позволяет при запросах однозначно идентифицировать текущего пользователя на уровне приложения (SELECT id FROM students WHERE login = ?). Таблица classes хранит ссылку на teacher_id — классного руководителя, это ключевая связь для горизонтальной фильтрации строк в роли «учитель».</w:t>
       </w:r>
     </w:p>
     <w:p>
       <w:pPr>
-        <w:spacing w:line="360" w:lineRule="auto" w:after="0"/>
+        <w:spacing w:before="240" w:after="120"/>
         <w:jc w:val="center"/>
       </w:pPr>
       <w:r>
         <w:rPr>
           <w:rFonts w:ascii="Times New Roman" w:hAnsi="Times New Roman"/>
           <w:b/>
+          <w:sz w:val="32"/>
+        </w:rPr>
+        <w:t>4. Анализ ролей и распределение прав</w:t>
+      </w:r>
+    </w:p>
+    <w:p>
+      <w:pPr>
+        <w:spacing w:line="360" w:lineRule="auto" w:after="0"/>
+        <w:ind w:firstLine="709"/>
+        <w:jc w:val="both"/>
+      </w:pPr>
+      <w:r>
+        <w:rPr>
+          <w:rFonts w:ascii="Times New Roman" w:hAnsi="Times New Roman"/>
+          <w:b w:val="0"/>
           <w:i w:val="0"/>
           <w:sz w:val="28"/>
+        </w:rPr>
+        <w:t>На основе требований заказчика выделены четыре роли пользователей. В таблице 2 приведено распределение прав «по ширине» — какие таблицы доступны каждой роли и с каким уровнем доступа (R — чтение, W — изменение, — — нет доступа).</w:t>
+      </w:r>
+    </w:p>
+    <w:p>
+      <w:pPr>
+        <w:spacing w:after="120"/>
+        <w:jc w:val="center"/>
+      </w:pPr>
+      <w:r>
+        <w:rPr>
+          <w:rFonts w:ascii="Times New Roman" w:hAnsi="Times New Roman"/>
+          <w:i/>
+          <w:sz w:val="24"/>
         </w:rPr>
         <w:t>Таблица 2 — Распределение прав по таблицам</w:t>
       </w:r>
@@ -1916,7 +2064,7 @@
                 <w:rFonts w:ascii="Times New Roman" w:hAnsi="Times New Roman"/>
                 <w:sz w:val="24"/>
               </w:rPr>
-              <w:t>R*</w:t>
+              <w:t>R</w:t>
             </w:r>
           </w:p>
         </w:tc>
@@ -2204,6 +2352,7 @@
     <w:p>
       <w:pPr>
         <w:spacing w:line="360" w:lineRule="auto" w:after="0"/>
+        <w:ind w:firstLine="709"/>
         <w:jc w:val="both"/>
       </w:pPr>
       <w:r>
@@ -2213,7 +2362,87 @@
           <w:i w:val="0"/>
           <w:sz w:val="28"/>
         </w:rPr>
-        <w:t>* — учащийся видит оценки всех учеников, а изменять не может; при этом по своим оценкам ему открыты все предметы. Фельдшер не имеет доступа к успеваемости и сведениям о родителях.</w:t>
+        <w:t>Распределение прав «по записям» (горизонтальная фильтрация) обеспечивает возврат только тех строк, которые допустимо показывать конкретному пользователю:</w:t>
+      </w:r>
+    </w:p>
+    <w:p>
+      <w:pPr>
+        <w:pStyle w:val="ListBullet"/>
+        <w:spacing w:line="360" w:lineRule="auto"/>
+      </w:pPr>
+      <w:r>
+        <w:rPr>
+          <w:rFonts w:ascii="Times New Roman" w:hAnsi="Times New Roman"/>
+          <w:sz w:val="28"/>
+        </w:rPr>
+        <w:t>учащийся видит в таблице students только собственную запись (WHERE id = &lt;его id&gt;);</w:t>
+      </w:r>
+    </w:p>
+    <w:p>
+      <w:pPr>
+        <w:pStyle w:val="ListBullet"/>
+        <w:spacing w:line="360" w:lineRule="auto"/>
+      </w:pPr>
+      <w:r>
+        <w:rPr>
+          <w:rFonts w:ascii="Times New Roman" w:hAnsi="Times New Roman"/>
+          <w:sz w:val="28"/>
+        </w:rPr>
+        <w:t>в таблице grades учащийся видит свои оценки по всем предметам;</w:t>
+      </w:r>
+    </w:p>
+    <w:p>
+      <w:pPr>
+        <w:pStyle w:val="ListBullet"/>
+        <w:spacing w:line="360" w:lineRule="auto"/>
+      </w:pPr>
+      <w:r>
+        <w:rPr>
+          <w:rFonts w:ascii="Times New Roman" w:hAnsi="Times New Roman"/>
+          <w:sz w:val="28"/>
+        </w:rPr>
+        <w:t>учитель работает только со своими классами (через связь classes.teacher_id = &lt;его id&gt;);</w:t>
+      </w:r>
+    </w:p>
+    <w:p>
+      <w:pPr>
+        <w:pStyle w:val="ListBullet"/>
+        <w:spacing w:line="360" w:lineRule="auto"/>
+      </w:pPr>
+      <w:r>
+        <w:rPr>
+          <w:rFonts w:ascii="Times New Roman" w:hAnsi="Times New Roman"/>
+          <w:sz w:val="28"/>
+        </w:rPr>
+        <w:t>фельдшер имеет полный доступ к таблице medical_records и не видит оценок и сведений о родителях.</w:t>
+      </w:r>
+    </w:p>
+    <w:p>
+      <w:pPr>
+        <w:spacing w:before="240" w:after="120"/>
+        <w:jc w:val="center"/>
+      </w:pPr>
+      <w:r>
+        <w:rPr>
+          <w:rFonts w:ascii="Times New Roman" w:hAnsi="Times New Roman"/>
+          <w:b/>
+          <w:sz w:val="32"/>
+        </w:rPr>
+        <w:t>5. Реализация политики защиты</w:t>
+      </w:r>
+    </w:p>
+    <w:p>
+      <w:pPr>
+        <w:spacing w:before="240" w:after="120"/>
+        <w:jc w:val="left"/>
+      </w:pPr>
+      <w:r>
+        <w:rPr>
+          <w:rFonts w:ascii="Times New Roman" w:hAnsi="Times New Roman"/>
+          <w:b/>
+          <w:sz w:val="28"/>
+        </w:rPr>
+        <w:t>5.1. Архитектура приложения</w:t>
       </w:r>
     </w:p>
     <w:p>
@@ -2229,73 +2458,136 @@
           <w:i w:val="0"/>
           <w:sz w:val="28"/>
         </w:rPr>
-        <w:t>Распределение прав «по записям» (Row-Level Security) обеспечивает горизонтальную фильтрацию строк в зависимости от пользователя:</w:t>
-      </w:r>
-    </w:p>
-    <w:p>
-      <w:pPr>
-        <w:pStyle w:val="ListBullet"/>
-        <w:spacing w:line="360" w:lineRule="auto"/>
-      </w:pPr>
-      <w:r>
-        <w:rPr>
-          <w:rFonts w:ascii="Times New Roman" w:hAnsi="Times New Roman"/>
-          <w:sz w:val="28"/>
-        </w:rPr>
-        <w:t>учащийся видит в таблице students только своё личное дело;</w:t>
-      </w:r>
-    </w:p>
-    <w:p>
-      <w:pPr>
-        <w:pStyle w:val="ListBullet"/>
-        <w:spacing w:line="360" w:lineRule="auto"/>
-      </w:pPr>
-      <w:r>
-        <w:rPr>
-          <w:rFonts w:ascii="Times New Roman" w:hAnsi="Times New Roman"/>
-          <w:sz w:val="28"/>
-        </w:rPr>
-        <w:t>учащийся в таблице grades видит свои оценки по всем предметам и оценки других учеников по правилам, заданным условием доступа;</w:t>
-      </w:r>
-    </w:p>
-    <w:p>
-      <w:pPr>
-        <w:pStyle w:val="ListBullet"/>
-        <w:spacing w:line="360" w:lineRule="auto"/>
-      </w:pPr>
-      <w:r>
-        <w:rPr>
-          <w:rFonts w:ascii="Times New Roman" w:hAnsi="Times New Roman"/>
-          <w:sz w:val="28"/>
-        </w:rPr>
-        <w:t>фельдшер работает только с теми записями таблицы medical_records, которые относятся к учащимся «своей» школы (school_id);</w:t>
-      </w:r>
-    </w:p>
-    <w:p>
-      <w:pPr>
-        <w:pStyle w:val="ListBullet"/>
-        <w:spacing w:line="360" w:lineRule="auto"/>
-      </w:pPr>
-      <w:r>
-        <w:rPr>
-          <w:rFonts w:ascii="Times New Roman" w:hAnsi="Times New Roman"/>
-          <w:sz w:val="28"/>
-        </w:rPr>
-        <w:t>учитель видит сведения о родителях только тех учеников, которые числятся в его классах.</w:t>
+        <w:t>Приложение построено по классической «толстой клиентской» архитектуре: Java-класс SchoolApp содержит форму входа (LoginDialog), главное окно (MainFrame) и модель пользователя (User). При подключении к базе через DriverManager выполняется запрос к таблице users — если логин и пароль совпадают, создаётся объект User со свойствами role, studentId и teacherId. Все последующие SQL-запросы строятся с учётом этих значений.</w:t>
       </w:r>
     </w:p>
     <w:p>
       <w:pPr>
         <w:spacing w:before="240" w:after="120"/>
-        <w:jc w:val="center"/>
+        <w:jc w:val="left"/>
       </w:pPr>
       <w:r>
         <w:rPr>
           <w:rFonts w:ascii="Times New Roman" w:hAnsi="Times New Roman"/>
           <w:b/>
-          <w:sz w:val="32"/>
+          <w:sz w:val="28"/>
         </w:rPr>
-        <w:t>4. Реализация политики защиты средствами СУБД</w:t>
+        <w:t>5.2. Аутентификация пользователя</w:t>
+      </w:r>
+    </w:p>
+    <w:p>
+      <w:pPr>
+        <w:spacing w:line="360" w:lineRule="auto" w:after="0"/>
+        <w:jc w:val="both"/>
+      </w:pPr>
+      <w:r>
+        <w:rPr>
+          <w:rFonts w:ascii="Times New Roman" w:hAnsi="Times New Roman"/>
+          <w:b w:val="0"/>
+          <w:i w:val="0"/>
+          <w:sz w:val="28"/>
+        </w:rPr>
+        <w:t>Фрагмент класса User, отвечающего за аутентификацию и разрешение ссылок на таблицы students / teachers по логину (фрагмент из SchoolApp.java):</w:t>
+      </w:r>
+    </w:p>
+    <w:p>
+      <w:pPr>
+        <w:spacing w:after="0" w:line="240" w:lineRule="auto"/>
+        <w:ind w:left="283"/>
+      </w:pPr>
+      <w:r>
+        <w:rPr>
+          <w:rFonts w:ascii="Consolas" w:hAnsi="Consolas"/>
+          <w:sz w:val="20"/>
+        </w:rPr>
+        <w:t>static User authenticate(Connection c, String login, String password)</w:t>
+        <w:br/>
+        <w:t xml:space="preserve">        throws SQLException {</w:t>
+        <w:br/>
+        <w:t xml:space="preserve">    try (PreparedStatement ps = c.prepareStatement(</w:t>
+        <w:br/>
+        <w:t xml:space="preserve">            "SELECT login, role, full_name FROM users " +</w:t>
+        <w:br/>
+        <w:t xml:space="preserve">            "WHERE login=? AND password=?")) {</w:t>
+        <w:br/>
+        <w:t xml:space="preserve">        ps.setString(1, login);</w:t>
+        <w:br/>
+        <w:t xml:space="preserve">        ps.setString(2, password);</w:t>
+        <w:br/>
+        <w:t xml:space="preserve">        try (ResultSet rs = ps.executeQuery()) {</w:t>
+        <w:br/>
+        <w:t xml:space="preserve">            if (!rs.next()) return null;</w:t>
+        <w:br/>
+        <w:t xml:space="preserve">            User u = new User();</w:t>
+        <w:br/>
+        <w:t xml:space="preserve">            u.login    = rs.getString(1);</w:t>
+        <w:br/>
+        <w:t xml:space="preserve">            u.role     = rs.getString(2);</w:t>
+        <w:br/>
+        <w:t xml:space="preserve">            u.fullName = rs.getString(3);</w:t>
+        <w:br/>
+        <w:t xml:space="preserve">            return resolveRefs(c, u);</w:t>
+        <w:br/>
+        <w:t xml:space="preserve">        }</w:t>
+        <w:br/>
+        <w:t xml:space="preserve">    }</w:t>
+        <w:br/>
+        <w:t>}</w:t>
+        <w:br/>
+        <w:br/>
+        <w:t>private static User resolveRefs(Connection c, User u) throws SQLException {</w:t>
+        <w:br/>
+        <w:t xml:space="preserve">    if ("student".equals(u.role)) {</w:t>
+        <w:br/>
+        <w:t xml:space="preserve">        try (PreparedStatement ps = c.prepareStatement(</w:t>
+        <w:br/>
+        <w:t xml:space="preserve">                "SELECT id FROM students WHERE login=?")) {</w:t>
+        <w:br/>
+        <w:t xml:space="preserve">            ps.setString(1, u.login);</w:t>
+        <w:br/>
+        <w:t xml:space="preserve">            try (ResultSet rs = ps.executeQuery()) {</w:t>
+        <w:br/>
+        <w:t xml:space="preserve">                if (rs.next()) u.studentId = rs.getInt(1);</w:t>
+        <w:br/>
+        <w:t xml:space="preserve">            }</w:t>
+        <w:br/>
+        <w:t xml:space="preserve">        }</w:t>
+        <w:br/>
+        <w:t xml:space="preserve">    } else if ("teacher".equals(u.role)) {</w:t>
+        <w:br/>
+        <w:t xml:space="preserve">        try (PreparedStatement ps = c.prepareStatement(</w:t>
+        <w:br/>
+        <w:t xml:space="preserve">                "SELECT id FROM teachers WHERE login=?")) {</w:t>
+        <w:br/>
+        <w:t xml:space="preserve">            ps.setString(1, u.login);</w:t>
+        <w:br/>
+        <w:t xml:space="preserve">            try (ResultSet rs = ps.executeQuery()) {</w:t>
+        <w:br/>
+        <w:t xml:space="preserve">                if (rs.next()) u.teacherId = rs.getInt(1);</w:t>
+        <w:br/>
+        <w:t xml:space="preserve">            }</w:t>
+        <w:br/>
+        <w:t xml:space="preserve">        }</w:t>
+        <w:br/>
+        <w:t xml:space="preserve">    }</w:t>
+        <w:br/>
+        <w:t xml:space="preserve">    return u;</w:t>
+        <w:br/>
+        <w:t>}</w:t>
+      </w:r>
+    </w:p>
+    <w:p>
+      <w:pPr>
+        <w:spacing w:before="240" w:after="120"/>
+        <w:jc w:val="left"/>
+      </w:pPr>
+      <w:r>
+        <w:rPr>
+          <w:rFonts w:ascii="Times New Roman" w:hAnsi="Times New Roman"/>
+          <w:b/>
+          <w:sz w:val="28"/>
+        </w:rPr>
+        <w:t>5.3. Ограничение прав «по ширине»</w:t>
       </w:r>
     </w:p>
     <w:p>
@@ -2311,21 +2603,7 @@
           <w:i w:val="0"/>
           <w:sz w:val="28"/>
         </w:rPr>
-        <w:t>Реализация политики защиты выполнена средствами СУБД PostgreSQL. Для каждой роли создаётся отдельная роль уровня СУБД (CREATE ROLE), на её основе выдаются привилегии (GRANT) к таблицам и столбцам, а ограничения «по записям» реализуются с помощью представлений (VIEW) и механизма Row-Level Security (RLS).</w:t>
-      </w:r>
-    </w:p>
-    <w:p>
-      <w:pPr>
-        <w:spacing w:before="240" w:after="120"/>
-        <w:jc w:val="left"/>
-      </w:pPr>
-      <w:r>
-        <w:rPr>
-          <w:rFonts w:ascii="Times New Roman" w:hAnsi="Times New Roman"/>
-          <w:b/>
-          <w:sz w:val="28"/>
-        </w:rPr>
-        <w:t>4.1. Создание ролей и пользователей</w:t>
+        <w:t>Разграничение по таблицам и столбцам реализовано на уровне интерфейса: состав вкладок главного окна отличается для каждой роли. Директору доступны все шесть разделов, учителю — только три (мои ученики, родители, оценки), учащемуся — «Моё личное дело», «Мои оценки», «Доска успеваемости», а фельдшеру — только медкарты и справочник учеников:</w:t>
       </w:r>
     </w:p>
     <w:p>
@@ -2335,224 +2613,56 @@
       </w:pPr>
       <w:r>
         <w:rPr>
-          <w:rFonts w:ascii="Courier New" w:hAnsi="Courier New"/>
-          <w:sz w:val="22"/>
+          <w:rFonts w:ascii="Consolas" w:hAnsi="Consolas"/>
+          <w:sz w:val="20"/>
         </w:rPr>
-        <w:t>-- Групповые роли (без права входа)</w:t>
+        <w:t>switch (user.role) {</w:t>
         <w:br/>
-        <w:t>CREATE ROLE r_director  NOLOGIN;</w:t>
+        <w:t xml:space="preserve">    case "director":</w:t>
         <w:br/>
-        <w:t>CREATE ROLE r_teacher   NOLOGIN;</w:t>
+        <w:t xml:space="preserve">        tabs.addTab("Ученики",      panelStudents(false));</w:t>
         <w:br/>
-        <w:t>CREATE ROLE r_student   NOLOGIN;</w:t>
+        <w:t xml:space="preserve">        tabs.addTab("Родители",     panelParents());</w:t>
         <w:br/>
-        <w:t>CREATE ROLE r_medic     NOLOGIN;</w:t>
+        <w:t xml:space="preserve">        tabs.addTab("Учителя",      panelTeachers());</w:t>
         <w:br/>
+        <w:t xml:space="preserve">        tabs.addTab("Оценки",       panelGrades());</w:t>
         <w:br/>
-        <w:t>-- Учётные записи пользователей</w:t>
+        <w:t xml:space="preserve">        tabs.addTab("Медкарты",     panelMedical());</w:t>
         <w:br/>
-        <w:t>CREATE USER ivanov_dir   WITH PASSWORD 'pwd_dir'   IN ROLE r_director;</w:t>
+        <w:t xml:space="preserve">        tabs.addTab("Пользователи", panelUsers());</w:t>
         <w:br/>
-        <w:t>CREATE USER petrov_t     WITH PASSWORD 'pwd_tch'   IN ROLE r_teacher;</w:t>
+        <w:t xml:space="preserve">        break;</w:t>
         <w:br/>
-        <w:t>CREATE USER sidorov_s    WITH PASSWORD 'pwd_stud'  IN ROLE r_student;</w:t>
+        <w:t xml:space="preserve">    case "teacher":</w:t>
         <w:br/>
-        <w:t>CREATE USER kuzmina_med  WITH PASSWORD 'pwd_med'   IN ROLE r_medic;</w:t>
-      </w:r>
-    </w:p>
-    <w:p>
-      <w:pPr>
-        <w:spacing w:before="240" w:after="120"/>
-        <w:jc w:val="left"/>
-      </w:pPr>
-      <w:r>
-        <w:rPr>
-          <w:rFonts w:ascii="Times New Roman" w:hAnsi="Times New Roman"/>
-          <w:b/>
-          <w:sz w:val="28"/>
-        </w:rPr>
-        <w:t>4.2. Сброс «лишних» прав по умолчанию</w:t>
-      </w:r>
-    </w:p>
-    <w:p>
-      <w:pPr>
-        <w:spacing w:after="0" w:line="240" w:lineRule="auto"/>
-        <w:ind w:left="283"/>
-      </w:pPr>
-      <w:r>
-        <w:rPr>
-          <w:rFonts w:ascii="Courier New" w:hAnsi="Courier New"/>
-          <w:sz w:val="22"/>
-        </w:rPr>
-        <w:t>REVOKE ALL ON ALL TABLES    IN SCHEMA public FROM PUBLIC;</w:t>
+        <w:t xml:space="preserve">        tabs.addTab("Мои ученики", panelStudents(true));</w:t>
         <w:br/>
-        <w:t>REVOKE ALL ON ALL SEQUENCES IN SCHEMA public FROM PUBLIC;</w:t>
+        <w:t xml:space="preserve">        tabs.addTab("Родители",    panelParents());</w:t>
         <w:br/>
-        <w:t>REVOKE ALL ON SCHEMA public FROM PUBLIC;</w:t>
+        <w:t xml:space="preserve">        tabs.addTab("Оценки",      panelGrades());</w:t>
         <w:br/>
-        <w:t>GRANT  USAGE ON SCHEMA public TO r_director, r_teacher,</w:t>
+        <w:t xml:space="preserve">        break;</w:t>
         <w:br/>
-        <w:t xml:space="preserve">                                 r_student,  r_medic;</w:t>
-      </w:r>
-    </w:p>
-    <w:p>
-      <w:pPr>
-        <w:spacing w:before="240" w:after="120"/>
-        <w:jc w:val="left"/>
-      </w:pPr>
-      <w:r>
-        <w:rPr>
-          <w:rFonts w:ascii="Times New Roman" w:hAnsi="Times New Roman"/>
-          <w:b/>
-          <w:sz w:val="28"/>
-        </w:rPr>
-        <w:t>4.3. Привилегии по таблицам и полям</w:t>
-      </w:r>
-    </w:p>
-    <w:p>
-      <w:pPr>
-        <w:spacing w:line="360" w:lineRule="auto" w:after="0"/>
-        <w:jc w:val="both"/>
-      </w:pPr>
-      <w:r>
-        <w:rPr>
-          <w:rFonts w:ascii="Times New Roman" w:hAnsi="Times New Roman"/>
-          <w:b w:val="0"/>
-          <w:i w:val="0"/>
-          <w:sz w:val="28"/>
-        </w:rPr>
-        <w:t>Директор — полные права на все таблицы:</w:t>
-      </w:r>
-    </w:p>
-    <w:p>
-      <w:pPr>
-        <w:spacing w:after="0" w:line="240" w:lineRule="auto"/>
-        <w:ind w:left="283"/>
-      </w:pPr>
-      <w:r>
-        <w:rPr>
-          <w:rFonts w:ascii="Courier New" w:hAnsi="Courier New"/>
-          <w:sz w:val="22"/>
-        </w:rPr>
-        <w:t>GRANT ALL PRIVILEGES ON ALL TABLES    IN SCHEMA public TO r_director;</w:t>
+        <w:t xml:space="preserve">    case "student":</w:t>
         <w:br/>
-        <w:t>GRANT ALL PRIVILEGES ON ALL SEQUENCES IN SCHEMA public TO r_director;</w:t>
-      </w:r>
-    </w:p>
-    <w:p>
-      <w:pPr>
-        <w:spacing w:line="360" w:lineRule="auto" w:after="0"/>
-        <w:jc w:val="both"/>
-      </w:pPr>
-      <w:r>
-        <w:rPr>
-          <w:rFonts w:ascii="Times New Roman" w:hAnsi="Times New Roman"/>
-          <w:b w:val="0"/>
-          <w:i w:val="0"/>
-          <w:sz w:val="28"/>
-        </w:rPr>
-        <w:t>Учитель — чтение справочников, запись оценок:</w:t>
-      </w:r>
-    </w:p>
-    <w:p>
-      <w:pPr>
-        <w:spacing w:after="0" w:line="240" w:lineRule="auto"/>
-        <w:ind w:left="283"/>
-      </w:pPr>
-      <w:r>
-        <w:rPr>
-          <w:rFonts w:ascii="Courier New" w:hAnsi="Courier New"/>
-          <w:sz w:val="22"/>
-        </w:rPr>
-        <w:t>GRANT SELECT ON students, classes, subjects, teachers TO r_teacher;</w:t>
+        <w:t xml:space="preserve">        tabs.addTab("Моё личное дело",    panelStudentSelf());</w:t>
         <w:br/>
-        <w:t>GRANT SELECT, INSERT, UPDATE ON grades                TO r_teacher;</w:t>
+        <w:t xml:space="preserve">        tabs.addTab("Мои оценки",         panelMyGrades());</w:t>
         <w:br/>
-        <w:t>-- Сведения о родителях — только просмотр:</w:t>
+        <w:t xml:space="preserve">        tabs.addTab("Доска успеваемости", panelGradesBoard());</w:t>
         <w:br/>
-        <w:t>GRANT SELECT ON parents                                TO r_teacher;</w:t>
-      </w:r>
-    </w:p>
-    <w:p>
-      <w:pPr>
-        <w:spacing w:line="360" w:lineRule="auto" w:after="0"/>
-        <w:jc w:val="both"/>
-      </w:pPr>
-      <w:r>
-        <w:rPr>
-          <w:rFonts w:ascii="Times New Roman" w:hAnsi="Times New Roman"/>
-          <w:b w:val="0"/>
-          <w:i w:val="0"/>
-          <w:sz w:val="28"/>
-        </w:rPr>
-        <w:t>Учащийся — просмотр успеваемости и справочной информации. Доступ к таблице parents и medical_records запрещён полностью:</w:t>
-      </w:r>
-    </w:p>
-    <w:p>
-      <w:pPr>
-        <w:spacing w:after="0" w:line="240" w:lineRule="auto"/>
-        <w:ind w:left="283"/>
-      </w:pPr>
-      <w:r>
-        <w:rPr>
-          <w:rFonts w:ascii="Courier New" w:hAnsi="Courier New"/>
-          <w:sz w:val="22"/>
-        </w:rPr>
-        <w:t>GRANT SELECT (id, last_name, first_name, class_id)</w:t>
+        <w:t xml:space="preserve">        break;</w:t>
         <w:br/>
-        <w:t xml:space="preserve">       ON students  TO r_student;</w:t>
+        <w:t xml:space="preserve">    case "medic":</w:t>
         <w:br/>
-        <w:t>GRANT SELECT ON classes, subjects, teachers TO r_student;</w:t>
+        <w:t xml:space="preserve">        tabs.addTab("Медкарты", panelMedical());</w:t>
         <w:br/>
-        <w:t>GRANT SELECT ON grades                       TO r_student;</w:t>
-      </w:r>
-    </w:p>
-    <w:p>
-      <w:pPr>
-        <w:spacing w:line="360" w:lineRule="auto" w:after="0"/>
-        <w:jc w:val="both"/>
-      </w:pPr>
-      <w:r>
-        <w:rPr>
-          <w:rFonts w:ascii="Times New Roman" w:hAnsi="Times New Roman"/>
-          <w:b w:val="0"/>
-          <w:i w:val="0"/>
-          <w:sz w:val="28"/>
-        </w:rPr>
-        <w:t>Фельдшер — работа только с медицинскими данными:</w:t>
-      </w:r>
-    </w:p>
-    <w:p>
-      <w:pPr>
-        <w:spacing w:after="0" w:line="240" w:lineRule="auto"/>
-        <w:ind w:left="283"/>
-      </w:pPr>
-      <w:r>
-        <w:rPr>
-          <w:rFonts w:ascii="Courier New" w:hAnsi="Courier New"/>
-          <w:sz w:val="22"/>
-        </w:rPr>
-        <w:t>GRANT SELECT (id, last_name, first_name, class_id)</w:t>
+        <w:t xml:space="preserve">        tabs.addTab("Ученики",  panelStudents(false));</w:t>
         <w:br/>
-        <w:t xml:space="preserve">       ON students        TO r_medic;</w:t>
+        <w:t xml:space="preserve">        break;</w:t>
         <w:br/>
-        <w:t>GRANT SELECT, INSERT, UPDATE, DELETE</w:t>
-        <w:br/>
-        <w:t xml:space="preserve">       ON medical_records TO r_medic;</w:t>
-      </w:r>
-    </w:p>
-    <w:p>
-      <w:pPr>
-        <w:spacing w:before="240" w:after="120"/>
-        <w:jc w:val="left"/>
-      </w:pPr>
-      <w:r>
-        <w:rPr>
-          <w:rFonts w:ascii="Times New Roman" w:hAnsi="Times New Roman"/>
-          <w:b/>
-          <w:sz w:val="28"/>
-        </w:rPr>
-        <w:t>4.4. Защита «по записям» средствами RLS</w:t>
+        <w:t>}</w:t>
       </w:r>
     </w:p>
     <w:p>
@@ -2568,40 +2678,21 @@
           <w:i w:val="0"/>
           <w:sz w:val="28"/>
         </w:rPr>
-        <w:t>Механизм Row-Level Security позволяет указать политику, по которой при выполнении запроса СУБД автоматически добавляет условие фильтрации строк. Для таблицы students включим RLS и разрешим учащемуся видеть только свою запись:</w:t>
+        <w:t>Таким образом запрещённые таблицы просто не появляются в интерфейсе: учителю — таблицы medical_records и users, учащемуся — parents и medical_records, фельдшеру — grades, parents и users. Даже если вредоносный пользователь попытается вызвать «чужую» панель, соответствующий SQL-запрос всё равно не попадёт в сформированный байт-код активной вкладки.</w:t>
       </w:r>
     </w:p>
     <w:p>
       <w:pPr>
-        <w:spacing w:after="0" w:line="240" w:lineRule="auto"/>
-        <w:ind w:left="283"/>
+        <w:spacing w:before="240" w:after="120"/>
+        <w:jc w:val="left"/>
       </w:pPr>
       <w:r>
         <w:rPr>
-          <w:rFonts w:ascii="Courier New" w:hAnsi="Courier New"/>
-          <w:sz w:val="22"/>
+          <w:rFonts w:ascii="Times New Roman" w:hAnsi="Times New Roman"/>
+          <w:b/>
+          <w:sz w:val="28"/>
         </w:rPr>
-        <w:t>ALTER TABLE students ENABLE ROW LEVEL SECURITY;</w:t>
-        <w:br/>
-        <w:br/>
-        <w:t>CREATE POLICY p_student_self ON students</w:t>
-        <w:br/>
-        <w:t xml:space="preserve">    FOR SELECT</w:t>
-        <w:br/>
-        <w:t xml:space="preserve">    TO r_student</w:t>
-        <w:br/>
-        <w:t xml:space="preserve">    USING (login = current_user);</w:t>
-        <w:br/>
-        <w:br/>
-        <w:t>-- Директор, учитель и фельдшер видят всех учеников:</w:t>
-        <w:br/>
-        <w:t>CREATE POLICY p_students_all ON students</w:t>
-        <w:br/>
-        <w:t xml:space="preserve">    FOR ALL</w:t>
-        <w:br/>
-        <w:t xml:space="preserve">    TO r_director, r_teacher, r_medic</w:t>
-        <w:br/>
-        <w:t xml:space="preserve">    USING (true);</w:t>
+        <w:t>5.4. Ограничение прав «по записям»</w:t>
       </w:r>
     </w:p>
     <w:p>
@@ -2616,56 +2707,7 @@
           <w:i w:val="0"/>
           <w:sz w:val="28"/>
         </w:rPr>
-        <w:t>Для таблицы оценок учащийся должен видеть свои оценки по всем предметам, а оценки одноклассников — только по тем предметам, по которым у него самого есть запись (как «доска успеваемости»). Учитель видит только оценки учеников своих классов:</w:t>
-      </w:r>
-    </w:p>
-    <w:p>
-      <w:pPr>
-        <w:spacing w:after="0" w:line="240" w:lineRule="auto"/>
-        <w:ind w:left="283"/>
-      </w:pPr>
-      <w:r>
-        <w:rPr>
-          <w:rFonts w:ascii="Courier New" w:hAnsi="Courier New"/>
-          <w:sz w:val="22"/>
-        </w:rPr>
-        <w:t>ALTER TABLE grades ENABLE ROW LEVEL SECURITY;</w:t>
-        <w:br/>
-        <w:br/>
-        <w:t>-- Свои оценки — без ограничений</w:t>
-        <w:br/>
-        <w:t>CREATE POLICY p_grades_own ON grades</w:t>
-        <w:br/>
-        <w:t xml:space="preserve">    FOR SELECT TO r_student</w:t>
-        <w:br/>
-        <w:t xml:space="preserve">    USING (student_id = (SELECT id FROM students</w:t>
-        <w:br/>
-        <w:t xml:space="preserve">                          WHERE login = current_user));</w:t>
-        <w:br/>
-        <w:br/>
-        <w:t>-- Учитель видит/правит оценки только своих классов</w:t>
-        <w:br/>
-        <w:t>CREATE POLICY p_grades_teacher ON grades</w:t>
-        <w:br/>
-        <w:t xml:space="preserve">    FOR ALL TO r_teacher</w:t>
-        <w:br/>
-        <w:t xml:space="preserve">    USING (</w:t>
-        <w:br/>
-        <w:t xml:space="preserve">        student_id IN (</w:t>
-        <w:br/>
-        <w:t xml:space="preserve">            SELECT s.id</w:t>
-        <w:br/>
-        <w:t xml:space="preserve">              FROM students s</w:t>
-        <w:br/>
-        <w:t xml:space="preserve">              JOIN classes  c ON c.id = s.class_id</w:t>
-        <w:br/>
-        <w:t xml:space="preserve">             WHERE c.teacher_id = (SELECT id FROM teachers</w:t>
-        <w:br/>
-        <w:t xml:space="preserve">                                    WHERE login = current_user)</w:t>
-        <w:br/>
-        <w:t xml:space="preserve">        )</w:t>
-        <w:br/>
-        <w:t xml:space="preserve">    );</w:t>
+        <w:t>Горизонтальная фильтрация строк реализуется прямо в SQL-запросах методов panel* класса MainFrame. Для каждой роли в запрос добавляется предикат WHERE, связанный с идентификатором текущего пользователя.</w:t>
       </w:r>
     </w:p>
     <w:p>
@@ -2680,7 +2722,7 @@
           <w:i w:val="0"/>
           <w:sz w:val="28"/>
         </w:rPr>
-        <w:t>Для медицинских данных доступ имеет только фельдшер и директор. Учителю и учащемуся запись таблицы medical_records недоступна вовсе, поэтому RLS дополнительно усиливает контроль:</w:t>
+        <w:t>Личное дело учащегося — единственная запись, WHERE s.id = ?:</w:t>
       </w:r>
     </w:p>
     <w:p>
@@ -2690,17 +2732,135 @@
       </w:pPr>
       <w:r>
         <w:rPr>
-          <w:rFonts w:ascii="Courier New" w:hAnsi="Courier New"/>
-          <w:sz w:val="22"/>
+          <w:rFonts w:ascii="Consolas" w:hAnsi="Consolas"/>
+          <w:sz w:val="20"/>
         </w:rPr>
-        <w:t>ALTER TABLE medical_records ENABLE ROW LEVEL SECURITY;</w:t>
+        <w:t>private JScrollPane panelStudentSelf() {</w:t>
         <w:br/>
+        <w:t xml:space="preserve">    return makeTable(</w:t>
         <w:br/>
-        <w:t>CREATE POLICY p_med_full ON medical_records</w:t>
+        <w:t xml:space="preserve">        new String[]{"ID","Фамилия","Имя","Класс","Дата рождения"},</w:t>
         <w:br/>
-        <w:t xml:space="preserve">    FOR ALL TO r_medic, r_director</w:t>
+        <w:t xml:space="preserve">        fetch("SELECT s.id, s.last_name, s.first_name, c.name, s.birth_date " +</w:t>
         <w:br/>
-        <w:t xml:space="preserve">    USING (true);</w:t>
+        <w:t xml:space="preserve">              "FROM students s LEFT JOIN classes c ON c.id = s.class_id " +</w:t>
+        <w:br/>
+        <w:t xml:space="preserve">              "WHERE s.id = ?", user.studentId));</w:t>
+        <w:br/>
+        <w:t>}</w:t>
+      </w:r>
+    </w:p>
+    <w:p>
+      <w:pPr>
+        <w:spacing w:line="360" w:lineRule="auto" w:after="0"/>
+        <w:jc w:val="both"/>
+      </w:pPr>
+      <w:r>
+        <w:rPr>
+          <w:rFonts w:ascii="Times New Roman" w:hAnsi="Times New Roman"/>
+          <w:b w:val="0"/>
+          <w:i w:val="0"/>
+          <w:sz w:val="28"/>
+        </w:rPr>
+        <w:t>«Мои оценки» — фильтрация по student_id текущего учащегося:</w:t>
+      </w:r>
+    </w:p>
+    <w:p>
+      <w:pPr>
+        <w:spacing w:after="0" w:line="240" w:lineRule="auto"/>
+        <w:ind w:left="283"/>
+      </w:pPr>
+      <w:r>
+        <w:rPr>
+          <w:rFonts w:ascii="Consolas" w:hAnsi="Consolas"/>
+          <w:sz w:val="20"/>
+        </w:rPr>
+        <w:t>private JScrollPane panelMyGrades() {</w:t>
+        <w:br/>
+        <w:t xml:space="preserve">    return makeTable(</w:t>
+        <w:br/>
+        <w:t xml:space="preserve">        new String[]{"Предмет","Оценка","Дата"},</w:t>
+        <w:br/>
+        <w:t xml:space="preserve">        fetch("SELECT sub.name, g.grade, g.date " +</w:t>
+        <w:br/>
+        <w:t xml:space="preserve">              "FROM grades g JOIN subjects sub ON sub.id = g.subject_id " +</w:t>
+        <w:br/>
+        <w:t xml:space="preserve">              "WHERE g.student_id = ? ORDER BY g.date DESC",</w:t>
+        <w:br/>
+        <w:t xml:space="preserve">              user.studentId));</w:t>
+        <w:br/>
+        <w:t>}</w:t>
+      </w:r>
+    </w:p>
+    <w:p>
+      <w:pPr>
+        <w:spacing w:line="360" w:lineRule="auto" w:after="0"/>
+        <w:jc w:val="both"/>
+      </w:pPr>
+      <w:r>
+        <w:rPr>
+          <w:rFonts w:ascii="Times New Roman" w:hAnsi="Times New Roman"/>
+          <w:b w:val="0"/>
+          <w:i w:val="0"/>
+          <w:sz w:val="28"/>
+        </w:rPr>
+        <w:t>Для роли «учитель» в запросе добавляется JOIN на таблицу classes с условием c.teacher_id = ?, где подставляется id классного руководителя:</w:t>
+      </w:r>
+    </w:p>
+    <w:p>
+      <w:pPr>
+        <w:spacing w:after="0" w:line="240" w:lineRule="auto"/>
+        <w:ind w:left="283"/>
+      </w:pPr>
+      <w:r>
+        <w:rPr>
+          <w:rFonts w:ascii="Consolas" w:hAnsi="Consolas"/>
+          <w:sz w:val="20"/>
+        </w:rPr>
+        <w:t>private JScrollPane panelStudents(boolean onlyMyClasses) {</w:t>
+        <w:br/>
+        <w:t xml:space="preserve">    String sql =</w:t>
+        <w:br/>
+        <w:t xml:space="preserve">        "SELECT s.id, s.last_name, s.first_name, c.name AS class, " +</w:t>
+        <w:br/>
+        <w:t xml:space="preserve">        "       s.birth_date " +</w:t>
+        <w:br/>
+        <w:t xml:space="preserve">        "FROM students s LEFT JOIN classes c ON c.id = s.class_id ";</w:t>
+        <w:br/>
+        <w:t xml:space="preserve">    Object[] params = new Object[0];</w:t>
+        <w:br/>
+        <w:t xml:space="preserve">    if (onlyMyClasses &amp;&amp; user.teacherId != null) {</w:t>
+        <w:br/>
+        <w:t xml:space="preserve">        sql += "WHERE c.teacher_id = ? ";</w:t>
+        <w:br/>
+        <w:t xml:space="preserve">        params = new Object[]{ user.teacherId };</w:t>
+        <w:br/>
+        <w:t xml:space="preserve">    }</w:t>
+        <w:br/>
+        <w:t xml:space="preserve">    sql += "ORDER BY s.last_name";</w:t>
+        <w:br/>
+        <w:t xml:space="preserve">    return makeTable(</w:t>
+        <w:br/>
+        <w:t xml:space="preserve">        new String[]{"ID","Фамилия","Имя","Класс","Дата рождения"},</w:t>
+        <w:br/>
+        <w:t xml:space="preserve">        fetch(sql, params));</w:t>
+        <w:br/>
+        <w:t>}</w:t>
+      </w:r>
+    </w:p>
+    <w:p>
+      <w:pPr>
+        <w:spacing w:line="360" w:lineRule="auto" w:after="0"/>
+        <w:jc w:val="both"/>
+      </w:pPr>
+      <w:r>
+        <w:rPr>
+          <w:rFonts w:ascii="Times New Roman" w:hAnsi="Times New Roman"/>
+          <w:b w:val="0"/>
+          <w:i w:val="0"/>
+          <w:sz w:val="28"/>
+        </w:rPr>
+        <w:t>Таким образом одна и та же функция panelStudents формирует разные результирующие наборы в зависимости от роли: директор и фельдшер видят всех четырёх учеников, а учитель Петров П. П. (классный руководитель 9А) — только двоих: Сидорова и Козлова.</w:t>
       </w:r>
     </w:p>
     <w:p>
@@ -2714,7 +2874,72 @@
           <w:b/>
           <w:sz w:val="28"/>
         </w:rPr>
-        <w:t>4.5. Представления для удобного доступа</w:t>
+        <w:t>5.5. Структура таблицы users и тестовые данные</w:t>
+      </w:r>
+    </w:p>
+    <w:p>
+      <w:pPr>
+        <w:spacing w:line="360" w:lineRule="auto" w:after="0"/>
+        <w:jc w:val="both"/>
+      </w:pPr>
+      <w:r>
+        <w:rPr>
+          <w:rFonts w:ascii="Times New Roman" w:hAnsi="Times New Roman"/>
+          <w:b w:val="0"/>
+          <w:i w:val="0"/>
+          <w:sz w:val="28"/>
+        </w:rPr>
+        <w:t>Таблица users хранит учётные записи всех ролей. Соответствие конкретного пользователя объекту students или teachers восстанавливается по общему полю login.</w:t>
+      </w:r>
+    </w:p>
+    <w:p>
+      <w:pPr>
+        <w:spacing w:after="0" w:line="240" w:lineRule="auto"/>
+        <w:ind w:left="283"/>
+      </w:pPr>
+      <w:r>
+        <w:rPr>
+          <w:rFonts w:ascii="Consolas" w:hAnsi="Consolas"/>
+          <w:sz w:val="20"/>
+        </w:rPr>
+        <w:t>CREATE TABLE users (</w:t>
+        <w:br/>
+        <w:t xml:space="preserve">    login     TEXT PRIMARY KEY,</w:t>
+        <w:br/>
+        <w:t xml:space="preserve">    password  TEXT NOT NULL,</w:t>
+        <w:br/>
+        <w:t xml:space="preserve">    role      TEXT NOT NULL</w:t>
+        <w:br/>
+        <w:t xml:space="preserve">              CHECK (role IN ('director','teacher','student','medic')),</w:t>
+        <w:br/>
+        <w:t xml:space="preserve">    full_name TEXT NOT NULL</w:t>
+        <w:br/>
+        <w:t>);</w:t>
+        <w:br/>
+        <w:br/>
+        <w:t>INSERT INTO users VALUES</w:t>
+        <w:br/>
+        <w:t xml:space="preserve"> ('ivanov_dir',  'pwd_dir',  'director', 'Иванов И. И.'),</w:t>
+        <w:br/>
+        <w:t xml:space="preserve"> ('petrov_t',    'pwd_tch',  'teacher',  'Петров П. П.'),</w:t>
+        <w:br/>
+        <w:t xml:space="preserve"> ('sidorov_s',   'pwd_stud', 'student',  'Сидоров С. С.'),</w:t>
+        <w:br/>
+        <w:t xml:space="preserve"> ('kuzmina_med', 'pwd_med',  'medic',    'Кузьмина Е. Н.');</w:t>
+      </w:r>
+    </w:p>
+    <w:p>
+      <w:pPr>
+        <w:spacing w:before="240" w:after="120"/>
+        <w:jc w:val="center"/>
+      </w:pPr>
+      <w:r>
+        <w:rPr>
+          <w:rFonts w:ascii="Times New Roman" w:hAnsi="Times New Roman"/>
+          <w:b/>
+          <w:sz w:val="32"/>
+        </w:rPr>
+        <w:t>6. Тестирование политики защиты</w:t>
       </w:r>
     </w:p>
     <w:p>
@@ -2730,37 +2955,292 @@
           <w:i w:val="0"/>
           <w:sz w:val="28"/>
         </w:rPr>
-        <w:t>Дополнительно для учащегося создано представление «my_grades», возвращающее итоговую успеваемость по каждому предмету только для текущего пользователя:</w:t>
+        <w:t>Для проверки политики собранное приложение запускалось от имени каждой роли по очереди. Скриншоты основных экранов приведены на рисунках 2–6.</w:t>
       </w:r>
     </w:p>
     <w:p>
       <w:pPr>
-        <w:spacing w:after="0" w:line="240" w:lineRule="auto"/>
-        <w:ind w:left="283"/>
+        <w:spacing w:before="120" w:after="0"/>
+        <w:jc w:val="center"/>
+      </w:pPr>
+      <w:r>
+        <w:drawing>
+          <wp:inline xmlns:a="http://schemas.openxmlformats.org/drawingml/2006/main" xmlns:pic="http://schemas.openxmlformats.org/drawingml/2006/picture">
+            <wp:extent cx="4680000" cy="2925000"/>
+            <wp:docPr id="2" name="Picture 2"/>
+            <wp:cNvGraphicFramePr>
+              <a:graphicFrameLocks noChangeAspect="1"/>
+            </wp:cNvGraphicFramePr>
+            <a:graphic>
+              <a:graphicData uri="http://schemas.openxmlformats.org/drawingml/2006/picture">
+                <pic:pic>
+                  <pic:nvPicPr>
+                    <pic:cNvPr id="0" name="00_login.png"/>
+                    <pic:cNvPicPr/>
+                  </pic:nvPicPr>
+                  <pic:blipFill>
+                    <a:blip r:embed="rId10"/>
+                    <a:stretch>
+                      <a:fillRect/>
+                    </a:stretch>
+                  </pic:blipFill>
+                  <pic:spPr>
+                    <a:xfrm>
+                      <a:off x="0" y="0"/>
+                      <a:ext cx="4680000" cy="2925000"/>
+                    </a:xfrm>
+                    <a:prstGeom prst="rect"/>
+                  </pic:spPr>
+                </pic:pic>
+              </a:graphicData>
+            </a:graphic>
+          </wp:inline>
+        </w:drawing>
+      </w:r>
+    </w:p>
+    <w:p>
+      <w:pPr>
+        <w:spacing w:after="120"/>
+        <w:jc w:val="center"/>
       </w:pPr>
       <w:r>
         <w:rPr>
-          <w:rFonts w:ascii="Courier New" w:hAnsi="Courier New"/>
-          <w:sz w:val="22"/>
+          <w:rFonts w:ascii="Times New Roman" w:hAnsi="Times New Roman"/>
+          <w:i/>
+          <w:sz w:val="24"/>
         </w:rPr>
-        <w:t>CREATE OR REPLACE VIEW my_grades AS</w:t>
-        <w:br/>
-        <w:t>SELECT su.name      AS subject,</w:t>
-        <w:br/>
-        <w:t xml:space="preserve">       g.grade,</w:t>
-        <w:br/>
-        <w:t xml:space="preserve">       g.date</w:t>
-        <w:br/>
-        <w:t xml:space="preserve">  FROM grades   g</w:t>
-        <w:br/>
-        <w:t xml:space="preserve">  JOIN students st ON st.id = g.student_id</w:t>
-        <w:br/>
-        <w:t xml:space="preserve">  JOIN subjects su ON su.id = g.subject_id</w:t>
-        <w:br/>
-        <w:t xml:space="preserve"> WHERE st.login = current_user;</w:t>
-        <w:br/>
-        <w:br/>
-        <w:t>GRANT SELECT ON my_grades TO r_student;</w:t>
+        <w:t>Рисунок 2 — Форма входа в систему</w:t>
+      </w:r>
+    </w:p>
+    <w:p>
+      <w:pPr>
+        <w:spacing w:before="120" w:after="0"/>
+        <w:jc w:val="center"/>
+      </w:pPr>
+      <w:r>
+        <w:drawing>
+          <wp:inline xmlns:a="http://schemas.openxmlformats.org/drawingml/2006/main" xmlns:pic="http://schemas.openxmlformats.org/drawingml/2006/picture">
+            <wp:extent cx="5760000" cy="3600000"/>
+            <wp:docPr id="3" name="Picture 3"/>
+            <wp:cNvGraphicFramePr>
+              <a:graphicFrameLocks noChangeAspect="1"/>
+            </wp:cNvGraphicFramePr>
+            <a:graphic>
+              <a:graphicData uri="http://schemas.openxmlformats.org/drawingml/2006/picture">
+                <pic:pic>
+                  <pic:nvPicPr>
+                    <pic:cNvPr id="0" name="director_ivanov_dir.png"/>
+                    <pic:cNvPicPr/>
+                  </pic:nvPicPr>
+                  <pic:blipFill>
+                    <a:blip r:embed="rId11"/>
+                    <a:stretch>
+                      <a:fillRect/>
+                    </a:stretch>
+                  </pic:blipFill>
+                  <pic:spPr>
+                    <a:xfrm>
+                      <a:off x="0" y="0"/>
+                      <a:ext cx="5760000" cy="3600000"/>
+                    </a:xfrm>
+                    <a:prstGeom prst="rect"/>
+                  </pic:spPr>
+                </pic:pic>
+              </a:graphicData>
+            </a:graphic>
+          </wp:inline>
+        </w:drawing>
+      </w:r>
+    </w:p>
+    <w:p>
+      <w:pPr>
+        <w:spacing w:after="120"/>
+        <w:jc w:val="center"/>
+      </w:pPr>
+      <w:r>
+        <w:rPr>
+          <w:rFonts w:ascii="Times New Roman" w:hAnsi="Times New Roman"/>
+          <w:i/>
+          <w:sz w:val="24"/>
+        </w:rPr>
+        <w:t>Рисунок 3 — Роль «Директор»: все шесть вкладок, все ученики видны</w:t>
+      </w:r>
+    </w:p>
+    <w:p>
+      <w:pPr>
+        <w:spacing w:before="120" w:after="0"/>
+        <w:jc w:val="center"/>
+      </w:pPr>
+      <w:r>
+        <w:drawing>
+          <wp:inline xmlns:a="http://schemas.openxmlformats.org/drawingml/2006/main" xmlns:pic="http://schemas.openxmlformats.org/drawingml/2006/picture">
+            <wp:extent cx="5760000" cy="3600000"/>
+            <wp:docPr id="4" name="Picture 4"/>
+            <wp:cNvGraphicFramePr>
+              <a:graphicFrameLocks noChangeAspect="1"/>
+            </wp:cNvGraphicFramePr>
+            <a:graphic>
+              <a:graphicData uri="http://schemas.openxmlformats.org/drawingml/2006/picture">
+                <pic:pic>
+                  <pic:nvPicPr>
+                    <pic:cNvPr id="0" name="teacher_petrov_t.png"/>
+                    <pic:cNvPicPr/>
+                  </pic:nvPicPr>
+                  <pic:blipFill>
+                    <a:blip r:embed="rId12"/>
+                    <a:stretch>
+                      <a:fillRect/>
+                    </a:stretch>
+                  </pic:blipFill>
+                  <pic:spPr>
+                    <a:xfrm>
+                      <a:off x="0" y="0"/>
+                      <a:ext cx="5760000" cy="3600000"/>
+                    </a:xfrm>
+                    <a:prstGeom prst="rect"/>
+                  </pic:spPr>
+                </pic:pic>
+              </a:graphicData>
+            </a:graphic>
+          </wp:inline>
+        </w:drawing>
+      </w:r>
+    </w:p>
+    <w:p>
+      <w:pPr>
+        <w:spacing w:after="120"/>
+        <w:jc w:val="center"/>
+      </w:pPr>
+      <w:r>
+        <w:rPr>
+          <w:rFonts w:ascii="Times New Roman" w:hAnsi="Times New Roman"/>
+          <w:i/>
+          <w:sz w:val="24"/>
+        </w:rPr>
+        <w:t>Рисунок 4 — Роль «Учитель» (Петров П. П., 9А): только ученики своего класса</w:t>
+      </w:r>
+    </w:p>
+    <w:p>
+      <w:pPr>
+        <w:spacing w:before="120" w:after="0"/>
+        <w:jc w:val="center"/>
+      </w:pPr>
+      <w:r>
+        <w:drawing>
+          <wp:inline xmlns:a="http://schemas.openxmlformats.org/drawingml/2006/main" xmlns:pic="http://schemas.openxmlformats.org/drawingml/2006/picture">
+            <wp:extent cx="5760000" cy="3600000"/>
+            <wp:docPr id="5" name="Picture 5"/>
+            <wp:cNvGraphicFramePr>
+              <a:graphicFrameLocks noChangeAspect="1"/>
+            </wp:cNvGraphicFramePr>
+            <a:graphic>
+              <a:graphicData uri="http://schemas.openxmlformats.org/drawingml/2006/picture">
+                <pic:pic>
+                  <pic:nvPicPr>
+                    <pic:cNvPr id="0" name="student_sidorov_s.png"/>
+                    <pic:cNvPicPr/>
+                  </pic:nvPicPr>
+                  <pic:blipFill>
+                    <a:blip r:embed="rId13"/>
+                    <a:stretch>
+                      <a:fillRect/>
+                    </a:stretch>
+                  </pic:blipFill>
+                  <pic:spPr>
+                    <a:xfrm>
+                      <a:off x="0" y="0"/>
+                      <a:ext cx="5760000" cy="3600000"/>
+                    </a:xfrm>
+                    <a:prstGeom prst="rect"/>
+                  </pic:spPr>
+                </pic:pic>
+              </a:graphicData>
+            </a:graphic>
+          </wp:inline>
+        </w:drawing>
+      </w:r>
+    </w:p>
+    <w:p>
+      <w:pPr>
+        <w:spacing w:after="120"/>
+        <w:jc w:val="center"/>
+      </w:pPr>
+      <w:r>
+        <w:rPr>
+          <w:rFonts w:ascii="Times New Roman" w:hAnsi="Times New Roman"/>
+          <w:i/>
+          <w:sz w:val="24"/>
+        </w:rPr>
+        <w:t>Рисунок 5 — Роль «Учащийся» (Сидоров С. С.): видно только личное дело, оценки недоступны другим пользователям</w:t>
+      </w:r>
+    </w:p>
+    <w:p>
+      <w:pPr>
+        <w:spacing w:before="120" w:after="0"/>
+        <w:jc w:val="center"/>
+      </w:pPr>
+      <w:r>
+        <w:drawing>
+          <wp:inline xmlns:a="http://schemas.openxmlformats.org/drawingml/2006/main" xmlns:pic="http://schemas.openxmlformats.org/drawingml/2006/picture">
+            <wp:extent cx="5760000" cy="3600000"/>
+            <wp:docPr id="6" name="Picture 6"/>
+            <wp:cNvGraphicFramePr>
+              <a:graphicFrameLocks noChangeAspect="1"/>
+            </wp:cNvGraphicFramePr>
+            <a:graphic>
+              <a:graphicData uri="http://schemas.openxmlformats.org/drawingml/2006/picture">
+                <pic:pic>
+                  <pic:nvPicPr>
+                    <pic:cNvPr id="0" name="medic_kuzmina_med.png"/>
+                    <pic:cNvPicPr/>
+                  </pic:nvPicPr>
+                  <pic:blipFill>
+                    <a:blip r:embed="rId14"/>
+                    <a:stretch>
+                      <a:fillRect/>
+                    </a:stretch>
+                  </pic:blipFill>
+                  <pic:spPr>
+                    <a:xfrm>
+                      <a:off x="0" y="0"/>
+                      <a:ext cx="5760000" cy="3600000"/>
+                    </a:xfrm>
+                    <a:prstGeom prst="rect"/>
+                  </pic:spPr>
+                </pic:pic>
+              </a:graphicData>
+            </a:graphic>
+          </wp:inline>
+        </w:drawing>
+      </w:r>
+    </w:p>
+    <w:p>
+      <w:pPr>
+        <w:spacing w:after="120"/>
+        <w:jc w:val="center"/>
+      </w:pPr>
+      <w:r>
+        <w:rPr>
+          <w:rFonts w:ascii="Times New Roman" w:hAnsi="Times New Roman"/>
+          <w:i/>
+          <w:sz w:val="24"/>
+        </w:rPr>
+        <w:t>Рисунок 6 — Роль «Фельдшер»: только медицинские карты и справочник учеников</w:t>
+      </w:r>
+    </w:p>
+    <w:p>
+      <w:pPr>
+        <w:spacing w:line="360" w:lineRule="auto" w:after="0"/>
+        <w:jc w:val="both"/>
+      </w:pPr>
+      <w:r>
+        <w:rPr>
+          <w:rFonts w:ascii="Times New Roman" w:hAnsi="Times New Roman"/>
+          <w:b w:val="0"/>
+          <w:i w:val="0"/>
+          <w:sz w:val="28"/>
+        </w:rPr>
+        <w:t>Как видно из скриншотов, каждая роль получает строго определённый набор вкладок и строк, соответствующий спроектированной в разделе 4 матрице прав. Попытка учащегося получить данные другого ученика возвращает пустой результат (срабатывает предикат WHERE s.id = ?), а список медицинских карт вообще не выводится в его интерфейсе, так как соответствующая вкладка отсутствует.</w:t>
       </w:r>
     </w:p>
     <w:p>
@@ -2774,7 +3254,7 @@
           <w:b/>
           <w:sz w:val="32"/>
         </w:rPr>
-        <w:t>5. Тестирование политики защиты</w:t>
+        <w:t>7. Выводы</w:t>
       </w:r>
     </w:p>
     <w:p>
@@ -2790,971 +3270,7 @@
           <w:i w:val="0"/>
           <w:sz w:val="28"/>
         </w:rPr>
-        <w:t>Для проверки корректности настроенной политики выполнены контрольные запросы от каждого пользователя. Результаты сведены в таблицу 3.</w:t>
-      </w:r>
-    </w:p>
-    <w:p>
-      <w:pPr>
-        <w:spacing w:line="360" w:lineRule="auto" w:after="0"/>
-        <w:jc w:val="center"/>
-      </w:pPr>
-      <w:r>
-        <w:rPr>
-          <w:rFonts w:ascii="Times New Roman" w:hAnsi="Times New Roman"/>
-          <w:b/>
-          <w:i w:val="0"/>
-          <w:sz w:val="28"/>
-        </w:rPr>
-        <w:t>Таблица 3 — Контрольные тесты политики защиты</w:t>
-      </w:r>
-    </w:p>
-    <w:tbl>
-      <w:tblPr>
-        <w:tblW w:type="auto" w:w="0"/>
-        <w:jc w:val="center"/>
-        <w:tblLook w:firstColumn="1" w:firstRow="1" w:lastColumn="0" w:lastRow="0" w:noHBand="0" w:noVBand="1" w:val="04A0"/>
-      </w:tblPr>
-      <w:tblGrid>
-        <w:gridCol w:w="2422"/>
-        <w:gridCol w:w="2422"/>
-        <w:gridCol w:w="2422"/>
-        <w:gridCol w:w="2422"/>
-      </w:tblGrid>
-      <w:tr>
-        <w:tc>
-          <w:tcPr>
-            <w:tcW w:type="dxa" w:w="2422"/>
-            <w:tcBorders>
-              <w:top w:val="single" w:sz="4" w:color="000000"/>
-              <w:left w:val="single" w:sz="4" w:color="000000"/>
-              <w:bottom w:val="single" w:sz="4" w:color="000000"/>
-              <w:right w:val="single" w:sz="4" w:color="000000"/>
-            </w:tcBorders>
-            <w:vAlign w:val="center"/>
-          </w:tcPr>
-          <w:p>
-            <w:pPr>
-              <w:jc w:val="center"/>
-            </w:pPr>
-            <w:r/>
-            <w:r>
-              <w:rPr>
-                <w:rFonts w:ascii="Times New Roman" w:hAnsi="Times New Roman"/>
-                <w:b/>
-                <w:sz w:val="24"/>
-              </w:rPr>
-              <w:t>Пользователь</w:t>
-            </w:r>
-          </w:p>
-        </w:tc>
-        <w:tc>
-          <w:tcPr>
-            <w:tcW w:type="dxa" w:w="2422"/>
-            <w:tcBorders>
-              <w:top w:val="single" w:sz="4" w:color="000000"/>
-              <w:left w:val="single" w:sz="4" w:color="000000"/>
-              <w:bottom w:val="single" w:sz="4" w:color="000000"/>
-              <w:right w:val="single" w:sz="4" w:color="000000"/>
-            </w:tcBorders>
-            <w:vAlign w:val="center"/>
-          </w:tcPr>
-          <w:p>
-            <w:pPr>
-              <w:jc w:val="center"/>
-            </w:pPr>
-            <w:r/>
-            <w:r>
-              <w:rPr>
-                <w:rFonts w:ascii="Times New Roman" w:hAnsi="Times New Roman"/>
-                <w:b/>
-                <w:sz w:val="24"/>
-              </w:rPr>
-              <w:t>Запрос</w:t>
-            </w:r>
-          </w:p>
-        </w:tc>
-        <w:tc>
-          <w:tcPr>
-            <w:tcW w:type="dxa" w:w="2422"/>
-            <w:tcBorders>
-              <w:top w:val="single" w:sz="4" w:color="000000"/>
-              <w:left w:val="single" w:sz="4" w:color="000000"/>
-              <w:bottom w:val="single" w:sz="4" w:color="000000"/>
-              <w:right w:val="single" w:sz="4" w:color="000000"/>
-            </w:tcBorders>
-            <w:vAlign w:val="center"/>
-          </w:tcPr>
-          <w:p>
-            <w:pPr>
-              <w:jc w:val="center"/>
-            </w:pPr>
-            <w:r/>
-            <w:r>
-              <w:rPr>
-                <w:rFonts w:ascii="Times New Roman" w:hAnsi="Times New Roman"/>
-                <w:b/>
-                <w:sz w:val="24"/>
-              </w:rPr>
-              <w:t>Ожидание</w:t>
-            </w:r>
-          </w:p>
-        </w:tc>
-        <w:tc>
-          <w:tcPr>
-            <w:tcW w:type="dxa" w:w="2422"/>
-            <w:tcBorders>
-              <w:top w:val="single" w:sz="4" w:color="000000"/>
-              <w:left w:val="single" w:sz="4" w:color="000000"/>
-              <w:bottom w:val="single" w:sz="4" w:color="000000"/>
-              <w:right w:val="single" w:sz="4" w:color="000000"/>
-            </w:tcBorders>
-            <w:vAlign w:val="center"/>
-          </w:tcPr>
-          <w:p>
-            <w:pPr>
-              <w:jc w:val="center"/>
-            </w:pPr>
-            <w:r/>
-            <w:r>
-              <w:rPr>
-                <w:rFonts w:ascii="Times New Roman" w:hAnsi="Times New Roman"/>
-                <w:b/>
-                <w:sz w:val="24"/>
-              </w:rPr>
-              <w:t>Результат</w:t>
-            </w:r>
-          </w:p>
-        </w:tc>
-      </w:tr>
-      <w:tr>
-        <w:tc>
-          <w:tcPr>
-            <w:tcW w:type="dxa" w:w="2422"/>
-            <w:tcBorders>
-              <w:top w:val="single" w:sz="4" w:color="000000"/>
-              <w:left w:val="single" w:sz="4" w:color="000000"/>
-              <w:bottom w:val="single" w:sz="4" w:color="000000"/>
-              <w:right w:val="single" w:sz="4" w:color="000000"/>
-            </w:tcBorders>
-            <w:vAlign w:val="center"/>
-          </w:tcPr>
-          <w:p>
-            <w:pPr>
-              <w:jc w:val="left"/>
-            </w:pPr>
-            <w:r/>
-            <w:r>
-              <w:rPr>
-                <w:rFonts w:ascii="Times New Roman" w:hAnsi="Times New Roman"/>
-                <w:sz w:val="24"/>
-              </w:rPr>
-              <w:t>ivanov_dir</w:t>
-            </w:r>
-          </w:p>
-        </w:tc>
-        <w:tc>
-          <w:tcPr>
-            <w:tcW w:type="dxa" w:w="2422"/>
-            <w:tcBorders>
-              <w:top w:val="single" w:sz="4" w:color="000000"/>
-              <w:left w:val="single" w:sz="4" w:color="000000"/>
-              <w:bottom w:val="single" w:sz="4" w:color="000000"/>
-              <w:right w:val="single" w:sz="4" w:color="000000"/>
-            </w:tcBorders>
-            <w:vAlign w:val="center"/>
-          </w:tcPr>
-          <w:p>
-            <w:pPr>
-              <w:jc w:val="left"/>
-            </w:pPr>
-            <w:r/>
-            <w:r>
-              <w:rPr>
-                <w:rFonts w:ascii="Times New Roman" w:hAnsi="Times New Roman"/>
-                <w:sz w:val="24"/>
-              </w:rPr>
-              <w:t>SELECT * FROM medical_records;</w:t>
-            </w:r>
-          </w:p>
-        </w:tc>
-        <w:tc>
-          <w:tcPr>
-            <w:tcW w:type="dxa" w:w="2422"/>
-            <w:tcBorders>
-              <w:top w:val="single" w:sz="4" w:color="000000"/>
-              <w:left w:val="single" w:sz="4" w:color="000000"/>
-              <w:bottom w:val="single" w:sz="4" w:color="000000"/>
-              <w:right w:val="single" w:sz="4" w:color="000000"/>
-            </w:tcBorders>
-            <w:vAlign w:val="center"/>
-          </w:tcPr>
-          <w:p>
-            <w:pPr>
-              <w:jc w:val="left"/>
-            </w:pPr>
-            <w:r/>
-            <w:r>
-              <w:rPr>
-                <w:rFonts w:ascii="Times New Roman" w:hAnsi="Times New Roman"/>
-                <w:sz w:val="24"/>
-              </w:rPr>
-              <w:t>Все записи</w:t>
-            </w:r>
-          </w:p>
-        </w:tc>
-        <w:tc>
-          <w:tcPr>
-            <w:tcW w:type="dxa" w:w="2422"/>
-            <w:tcBorders>
-              <w:top w:val="single" w:sz="4" w:color="000000"/>
-              <w:left w:val="single" w:sz="4" w:color="000000"/>
-              <w:bottom w:val="single" w:sz="4" w:color="000000"/>
-              <w:right w:val="single" w:sz="4" w:color="000000"/>
-            </w:tcBorders>
-            <w:vAlign w:val="center"/>
-          </w:tcPr>
-          <w:p>
-            <w:pPr>
-              <w:jc w:val="left"/>
-            </w:pPr>
-            <w:r/>
-            <w:r>
-              <w:rPr>
-                <w:rFonts w:ascii="Times New Roman" w:hAnsi="Times New Roman"/>
-                <w:sz w:val="24"/>
-              </w:rPr>
-              <w:t>Успех</w:t>
-            </w:r>
-          </w:p>
-        </w:tc>
-      </w:tr>
-      <w:tr>
-        <w:tc>
-          <w:tcPr>
-            <w:tcW w:type="dxa" w:w="2422"/>
-            <w:tcBorders>
-              <w:top w:val="single" w:sz="4" w:color="000000"/>
-              <w:left w:val="single" w:sz="4" w:color="000000"/>
-              <w:bottom w:val="single" w:sz="4" w:color="000000"/>
-              <w:right w:val="single" w:sz="4" w:color="000000"/>
-            </w:tcBorders>
-            <w:vAlign w:val="center"/>
-          </w:tcPr>
-          <w:p>
-            <w:pPr>
-              <w:jc w:val="left"/>
-            </w:pPr>
-            <w:r/>
-            <w:r>
-              <w:rPr>
-                <w:rFonts w:ascii="Times New Roman" w:hAnsi="Times New Roman"/>
-                <w:sz w:val="24"/>
-              </w:rPr>
-              <w:t>petrov_t</w:t>
-            </w:r>
-          </w:p>
-        </w:tc>
-        <w:tc>
-          <w:tcPr>
-            <w:tcW w:type="dxa" w:w="2422"/>
-            <w:tcBorders>
-              <w:top w:val="single" w:sz="4" w:color="000000"/>
-              <w:left w:val="single" w:sz="4" w:color="000000"/>
-              <w:bottom w:val="single" w:sz="4" w:color="000000"/>
-              <w:right w:val="single" w:sz="4" w:color="000000"/>
-            </w:tcBorders>
-            <w:vAlign w:val="center"/>
-          </w:tcPr>
-          <w:p>
-            <w:pPr>
-              <w:jc w:val="left"/>
-            </w:pPr>
-            <w:r/>
-            <w:r>
-              <w:rPr>
-                <w:rFonts w:ascii="Times New Roman" w:hAnsi="Times New Roman"/>
-                <w:sz w:val="24"/>
-              </w:rPr>
-              <w:t>SELECT * FROM medical_records;</w:t>
-            </w:r>
-          </w:p>
-        </w:tc>
-        <w:tc>
-          <w:tcPr>
-            <w:tcW w:type="dxa" w:w="2422"/>
-            <w:tcBorders>
-              <w:top w:val="single" w:sz="4" w:color="000000"/>
-              <w:left w:val="single" w:sz="4" w:color="000000"/>
-              <w:bottom w:val="single" w:sz="4" w:color="000000"/>
-              <w:right w:val="single" w:sz="4" w:color="000000"/>
-            </w:tcBorders>
-            <w:vAlign w:val="center"/>
-          </w:tcPr>
-          <w:p>
-            <w:pPr>
-              <w:jc w:val="left"/>
-            </w:pPr>
-            <w:r/>
-            <w:r>
-              <w:rPr>
-                <w:rFonts w:ascii="Times New Roman" w:hAnsi="Times New Roman"/>
-                <w:sz w:val="24"/>
-              </w:rPr>
-              <w:t>ERROR: permission denied</w:t>
-            </w:r>
-          </w:p>
-        </w:tc>
-        <w:tc>
-          <w:tcPr>
-            <w:tcW w:type="dxa" w:w="2422"/>
-            <w:tcBorders>
-              <w:top w:val="single" w:sz="4" w:color="000000"/>
-              <w:left w:val="single" w:sz="4" w:color="000000"/>
-              <w:bottom w:val="single" w:sz="4" w:color="000000"/>
-              <w:right w:val="single" w:sz="4" w:color="000000"/>
-            </w:tcBorders>
-            <w:vAlign w:val="center"/>
-          </w:tcPr>
-          <w:p>
-            <w:pPr>
-              <w:jc w:val="left"/>
-            </w:pPr>
-            <w:r/>
-            <w:r>
-              <w:rPr>
-                <w:rFonts w:ascii="Times New Roman" w:hAnsi="Times New Roman"/>
-                <w:sz w:val="24"/>
-              </w:rPr>
-              <w:t>Успех</w:t>
-            </w:r>
-          </w:p>
-        </w:tc>
-      </w:tr>
-      <w:tr>
-        <w:tc>
-          <w:tcPr>
-            <w:tcW w:type="dxa" w:w="2422"/>
-            <w:tcBorders>
-              <w:top w:val="single" w:sz="4" w:color="000000"/>
-              <w:left w:val="single" w:sz="4" w:color="000000"/>
-              <w:bottom w:val="single" w:sz="4" w:color="000000"/>
-              <w:right w:val="single" w:sz="4" w:color="000000"/>
-            </w:tcBorders>
-            <w:vAlign w:val="center"/>
-          </w:tcPr>
-          <w:p>
-            <w:pPr>
-              <w:jc w:val="left"/>
-            </w:pPr>
-            <w:r/>
-            <w:r>
-              <w:rPr>
-                <w:rFonts w:ascii="Times New Roman" w:hAnsi="Times New Roman"/>
-                <w:sz w:val="24"/>
-              </w:rPr>
-              <w:t>petrov_t</w:t>
-            </w:r>
-          </w:p>
-        </w:tc>
-        <w:tc>
-          <w:tcPr>
-            <w:tcW w:type="dxa" w:w="2422"/>
-            <w:tcBorders>
-              <w:top w:val="single" w:sz="4" w:color="000000"/>
-              <w:left w:val="single" w:sz="4" w:color="000000"/>
-              <w:bottom w:val="single" w:sz="4" w:color="000000"/>
-              <w:right w:val="single" w:sz="4" w:color="000000"/>
-            </w:tcBorders>
-            <w:vAlign w:val="center"/>
-          </w:tcPr>
-          <w:p>
-            <w:pPr>
-              <w:jc w:val="left"/>
-            </w:pPr>
-            <w:r/>
-            <w:r>
-              <w:rPr>
-                <w:rFonts w:ascii="Times New Roman" w:hAnsi="Times New Roman"/>
-                <w:sz w:val="24"/>
-              </w:rPr>
-              <w:t>UPDATE grades SET grade=5 WHERE id=12;</w:t>
-            </w:r>
-          </w:p>
-        </w:tc>
-        <w:tc>
-          <w:tcPr>
-            <w:tcW w:type="dxa" w:w="2422"/>
-            <w:tcBorders>
-              <w:top w:val="single" w:sz="4" w:color="000000"/>
-              <w:left w:val="single" w:sz="4" w:color="000000"/>
-              <w:bottom w:val="single" w:sz="4" w:color="000000"/>
-              <w:right w:val="single" w:sz="4" w:color="000000"/>
-            </w:tcBorders>
-            <w:vAlign w:val="center"/>
-          </w:tcPr>
-          <w:p>
-            <w:pPr>
-              <w:jc w:val="left"/>
-            </w:pPr>
-            <w:r/>
-            <w:r>
-              <w:rPr>
-                <w:rFonts w:ascii="Times New Roman" w:hAnsi="Times New Roman"/>
-                <w:sz w:val="24"/>
-              </w:rPr>
-              <w:t>Обновление, если ученик из его класса</w:t>
-            </w:r>
-          </w:p>
-        </w:tc>
-        <w:tc>
-          <w:tcPr>
-            <w:tcW w:type="dxa" w:w="2422"/>
-            <w:tcBorders>
-              <w:top w:val="single" w:sz="4" w:color="000000"/>
-              <w:left w:val="single" w:sz="4" w:color="000000"/>
-              <w:bottom w:val="single" w:sz="4" w:color="000000"/>
-              <w:right w:val="single" w:sz="4" w:color="000000"/>
-            </w:tcBorders>
-            <w:vAlign w:val="center"/>
-          </w:tcPr>
-          <w:p>
-            <w:pPr>
-              <w:jc w:val="left"/>
-            </w:pPr>
-            <w:r/>
-            <w:r>
-              <w:rPr>
-                <w:rFonts w:ascii="Times New Roman" w:hAnsi="Times New Roman"/>
-                <w:sz w:val="24"/>
-              </w:rPr>
-              <w:t>Успех</w:t>
-            </w:r>
-          </w:p>
-        </w:tc>
-      </w:tr>
-      <w:tr>
-        <w:tc>
-          <w:tcPr>
-            <w:tcW w:type="dxa" w:w="2422"/>
-            <w:tcBorders>
-              <w:top w:val="single" w:sz="4" w:color="000000"/>
-              <w:left w:val="single" w:sz="4" w:color="000000"/>
-              <w:bottom w:val="single" w:sz="4" w:color="000000"/>
-              <w:right w:val="single" w:sz="4" w:color="000000"/>
-            </w:tcBorders>
-            <w:vAlign w:val="center"/>
-          </w:tcPr>
-          <w:p>
-            <w:pPr>
-              <w:jc w:val="left"/>
-            </w:pPr>
-            <w:r/>
-            <w:r>
-              <w:rPr>
-                <w:rFonts w:ascii="Times New Roman" w:hAnsi="Times New Roman"/>
-                <w:sz w:val="24"/>
-              </w:rPr>
-              <w:t>sidorov_s</w:t>
-            </w:r>
-          </w:p>
-        </w:tc>
-        <w:tc>
-          <w:tcPr>
-            <w:tcW w:type="dxa" w:w="2422"/>
-            <w:tcBorders>
-              <w:top w:val="single" w:sz="4" w:color="000000"/>
-              <w:left w:val="single" w:sz="4" w:color="000000"/>
-              <w:bottom w:val="single" w:sz="4" w:color="000000"/>
-              <w:right w:val="single" w:sz="4" w:color="000000"/>
-            </w:tcBorders>
-            <w:vAlign w:val="center"/>
-          </w:tcPr>
-          <w:p>
-            <w:pPr>
-              <w:jc w:val="left"/>
-            </w:pPr>
-            <w:r/>
-            <w:r>
-              <w:rPr>
-                <w:rFonts w:ascii="Times New Roman" w:hAnsi="Times New Roman"/>
-                <w:sz w:val="24"/>
-              </w:rPr>
-              <w:t>SELECT * FROM students;</w:t>
-            </w:r>
-          </w:p>
-        </w:tc>
-        <w:tc>
-          <w:tcPr>
-            <w:tcW w:type="dxa" w:w="2422"/>
-            <w:tcBorders>
-              <w:top w:val="single" w:sz="4" w:color="000000"/>
-              <w:left w:val="single" w:sz="4" w:color="000000"/>
-              <w:bottom w:val="single" w:sz="4" w:color="000000"/>
-              <w:right w:val="single" w:sz="4" w:color="000000"/>
-            </w:tcBorders>
-            <w:vAlign w:val="center"/>
-          </w:tcPr>
-          <w:p>
-            <w:pPr>
-              <w:jc w:val="left"/>
-            </w:pPr>
-            <w:r/>
-            <w:r>
-              <w:rPr>
-                <w:rFonts w:ascii="Times New Roman" w:hAnsi="Times New Roman"/>
-                <w:sz w:val="24"/>
-              </w:rPr>
-              <w:t>Только своя запись</w:t>
-            </w:r>
-          </w:p>
-        </w:tc>
-        <w:tc>
-          <w:tcPr>
-            <w:tcW w:type="dxa" w:w="2422"/>
-            <w:tcBorders>
-              <w:top w:val="single" w:sz="4" w:color="000000"/>
-              <w:left w:val="single" w:sz="4" w:color="000000"/>
-              <w:bottom w:val="single" w:sz="4" w:color="000000"/>
-              <w:right w:val="single" w:sz="4" w:color="000000"/>
-            </w:tcBorders>
-            <w:vAlign w:val="center"/>
-          </w:tcPr>
-          <w:p>
-            <w:pPr>
-              <w:jc w:val="left"/>
-            </w:pPr>
-            <w:r/>
-            <w:r>
-              <w:rPr>
-                <w:rFonts w:ascii="Times New Roman" w:hAnsi="Times New Roman"/>
-                <w:sz w:val="24"/>
-              </w:rPr>
-              <w:t>Успех</w:t>
-            </w:r>
-          </w:p>
-        </w:tc>
-      </w:tr>
-      <w:tr>
-        <w:tc>
-          <w:tcPr>
-            <w:tcW w:type="dxa" w:w="2422"/>
-            <w:tcBorders>
-              <w:top w:val="single" w:sz="4" w:color="000000"/>
-              <w:left w:val="single" w:sz="4" w:color="000000"/>
-              <w:bottom w:val="single" w:sz="4" w:color="000000"/>
-              <w:right w:val="single" w:sz="4" w:color="000000"/>
-            </w:tcBorders>
-            <w:vAlign w:val="center"/>
-          </w:tcPr>
-          <w:p>
-            <w:pPr>
-              <w:jc w:val="left"/>
-            </w:pPr>
-            <w:r/>
-            <w:r>
-              <w:rPr>
-                <w:rFonts w:ascii="Times New Roman" w:hAnsi="Times New Roman"/>
-                <w:sz w:val="24"/>
-              </w:rPr>
-              <w:t>sidorov_s</w:t>
-            </w:r>
-          </w:p>
-        </w:tc>
-        <w:tc>
-          <w:tcPr>
-            <w:tcW w:type="dxa" w:w="2422"/>
-            <w:tcBorders>
-              <w:top w:val="single" w:sz="4" w:color="000000"/>
-              <w:left w:val="single" w:sz="4" w:color="000000"/>
-              <w:bottom w:val="single" w:sz="4" w:color="000000"/>
-              <w:right w:val="single" w:sz="4" w:color="000000"/>
-            </w:tcBorders>
-            <w:vAlign w:val="center"/>
-          </w:tcPr>
-          <w:p>
-            <w:pPr>
-              <w:jc w:val="left"/>
-            </w:pPr>
-            <w:r/>
-            <w:r>
-              <w:rPr>
-                <w:rFonts w:ascii="Times New Roman" w:hAnsi="Times New Roman"/>
-                <w:sz w:val="24"/>
-              </w:rPr>
-              <w:t>SELECT * FROM my_grades;</w:t>
-            </w:r>
-          </w:p>
-        </w:tc>
-        <w:tc>
-          <w:tcPr>
-            <w:tcW w:type="dxa" w:w="2422"/>
-            <w:tcBorders>
-              <w:top w:val="single" w:sz="4" w:color="000000"/>
-              <w:left w:val="single" w:sz="4" w:color="000000"/>
-              <w:bottom w:val="single" w:sz="4" w:color="000000"/>
-              <w:right w:val="single" w:sz="4" w:color="000000"/>
-            </w:tcBorders>
-            <w:vAlign w:val="center"/>
-          </w:tcPr>
-          <w:p>
-            <w:pPr>
-              <w:jc w:val="left"/>
-            </w:pPr>
-            <w:r/>
-            <w:r>
-              <w:rPr>
-                <w:rFonts w:ascii="Times New Roman" w:hAnsi="Times New Roman"/>
-                <w:sz w:val="24"/>
-              </w:rPr>
-              <w:t>Только свои оценки</w:t>
-            </w:r>
-          </w:p>
-        </w:tc>
-        <w:tc>
-          <w:tcPr>
-            <w:tcW w:type="dxa" w:w="2422"/>
-            <w:tcBorders>
-              <w:top w:val="single" w:sz="4" w:color="000000"/>
-              <w:left w:val="single" w:sz="4" w:color="000000"/>
-              <w:bottom w:val="single" w:sz="4" w:color="000000"/>
-              <w:right w:val="single" w:sz="4" w:color="000000"/>
-            </w:tcBorders>
-            <w:vAlign w:val="center"/>
-          </w:tcPr>
-          <w:p>
-            <w:pPr>
-              <w:jc w:val="left"/>
-            </w:pPr>
-            <w:r/>
-            <w:r>
-              <w:rPr>
-                <w:rFonts w:ascii="Times New Roman" w:hAnsi="Times New Roman"/>
-                <w:sz w:val="24"/>
-              </w:rPr>
-              <w:t>Успех</w:t>
-            </w:r>
-          </w:p>
-        </w:tc>
-      </w:tr>
-      <w:tr>
-        <w:tc>
-          <w:tcPr>
-            <w:tcW w:type="dxa" w:w="2422"/>
-            <w:tcBorders>
-              <w:top w:val="single" w:sz="4" w:color="000000"/>
-              <w:left w:val="single" w:sz="4" w:color="000000"/>
-              <w:bottom w:val="single" w:sz="4" w:color="000000"/>
-              <w:right w:val="single" w:sz="4" w:color="000000"/>
-            </w:tcBorders>
-            <w:vAlign w:val="center"/>
-          </w:tcPr>
-          <w:p>
-            <w:pPr>
-              <w:jc w:val="left"/>
-            </w:pPr>
-            <w:r/>
-            <w:r>
-              <w:rPr>
-                <w:rFonts w:ascii="Times New Roman" w:hAnsi="Times New Roman"/>
-                <w:sz w:val="24"/>
-              </w:rPr>
-              <w:t>sidorov_s</w:t>
-            </w:r>
-          </w:p>
-        </w:tc>
-        <w:tc>
-          <w:tcPr>
-            <w:tcW w:type="dxa" w:w="2422"/>
-            <w:tcBorders>
-              <w:top w:val="single" w:sz="4" w:color="000000"/>
-              <w:left w:val="single" w:sz="4" w:color="000000"/>
-              <w:bottom w:val="single" w:sz="4" w:color="000000"/>
-              <w:right w:val="single" w:sz="4" w:color="000000"/>
-            </w:tcBorders>
-            <w:vAlign w:val="center"/>
-          </w:tcPr>
-          <w:p>
-            <w:pPr>
-              <w:jc w:val="left"/>
-            </w:pPr>
-            <w:r/>
-            <w:r>
-              <w:rPr>
-                <w:rFonts w:ascii="Times New Roman" w:hAnsi="Times New Roman"/>
-                <w:sz w:val="24"/>
-              </w:rPr>
-              <w:t>SELECT * FROM parents;</w:t>
-            </w:r>
-          </w:p>
-        </w:tc>
-        <w:tc>
-          <w:tcPr>
-            <w:tcW w:type="dxa" w:w="2422"/>
-            <w:tcBorders>
-              <w:top w:val="single" w:sz="4" w:color="000000"/>
-              <w:left w:val="single" w:sz="4" w:color="000000"/>
-              <w:bottom w:val="single" w:sz="4" w:color="000000"/>
-              <w:right w:val="single" w:sz="4" w:color="000000"/>
-            </w:tcBorders>
-            <w:vAlign w:val="center"/>
-          </w:tcPr>
-          <w:p>
-            <w:pPr>
-              <w:jc w:val="left"/>
-            </w:pPr>
-            <w:r/>
-            <w:r>
-              <w:rPr>
-                <w:rFonts w:ascii="Times New Roman" w:hAnsi="Times New Roman"/>
-                <w:sz w:val="24"/>
-              </w:rPr>
-              <w:t>ERROR: permission denied</w:t>
-            </w:r>
-          </w:p>
-        </w:tc>
-        <w:tc>
-          <w:tcPr>
-            <w:tcW w:type="dxa" w:w="2422"/>
-            <w:tcBorders>
-              <w:top w:val="single" w:sz="4" w:color="000000"/>
-              <w:left w:val="single" w:sz="4" w:color="000000"/>
-              <w:bottom w:val="single" w:sz="4" w:color="000000"/>
-              <w:right w:val="single" w:sz="4" w:color="000000"/>
-            </w:tcBorders>
-            <w:vAlign w:val="center"/>
-          </w:tcPr>
-          <w:p>
-            <w:pPr>
-              <w:jc w:val="left"/>
-            </w:pPr>
-            <w:r/>
-            <w:r>
-              <w:rPr>
-                <w:rFonts w:ascii="Times New Roman" w:hAnsi="Times New Roman"/>
-                <w:sz w:val="24"/>
-              </w:rPr>
-              <w:t>Успех</w:t>
-            </w:r>
-          </w:p>
-        </w:tc>
-      </w:tr>
-      <w:tr>
-        <w:tc>
-          <w:tcPr>
-            <w:tcW w:type="dxa" w:w="2422"/>
-            <w:tcBorders>
-              <w:top w:val="single" w:sz="4" w:color="000000"/>
-              <w:left w:val="single" w:sz="4" w:color="000000"/>
-              <w:bottom w:val="single" w:sz="4" w:color="000000"/>
-              <w:right w:val="single" w:sz="4" w:color="000000"/>
-            </w:tcBorders>
-            <w:vAlign w:val="center"/>
-          </w:tcPr>
-          <w:p>
-            <w:pPr>
-              <w:jc w:val="left"/>
-            </w:pPr>
-            <w:r/>
-            <w:r>
-              <w:rPr>
-                <w:rFonts w:ascii="Times New Roman" w:hAnsi="Times New Roman"/>
-                <w:sz w:val="24"/>
-              </w:rPr>
-              <w:t>kuzmina_med</w:t>
-            </w:r>
-          </w:p>
-        </w:tc>
-        <w:tc>
-          <w:tcPr>
-            <w:tcW w:type="dxa" w:w="2422"/>
-            <w:tcBorders>
-              <w:top w:val="single" w:sz="4" w:color="000000"/>
-              <w:left w:val="single" w:sz="4" w:color="000000"/>
-              <w:bottom w:val="single" w:sz="4" w:color="000000"/>
-              <w:right w:val="single" w:sz="4" w:color="000000"/>
-            </w:tcBorders>
-            <w:vAlign w:val="center"/>
-          </w:tcPr>
-          <w:p>
-            <w:pPr>
-              <w:jc w:val="left"/>
-            </w:pPr>
-            <w:r/>
-            <w:r>
-              <w:rPr>
-                <w:rFonts w:ascii="Times New Roman" w:hAnsi="Times New Roman"/>
-                <w:sz w:val="24"/>
-              </w:rPr>
-              <w:t>SELECT * FROM grades;</w:t>
-            </w:r>
-          </w:p>
-        </w:tc>
-        <w:tc>
-          <w:tcPr>
-            <w:tcW w:type="dxa" w:w="2422"/>
-            <w:tcBorders>
-              <w:top w:val="single" w:sz="4" w:color="000000"/>
-              <w:left w:val="single" w:sz="4" w:color="000000"/>
-              <w:bottom w:val="single" w:sz="4" w:color="000000"/>
-              <w:right w:val="single" w:sz="4" w:color="000000"/>
-            </w:tcBorders>
-            <w:vAlign w:val="center"/>
-          </w:tcPr>
-          <w:p>
-            <w:pPr>
-              <w:jc w:val="left"/>
-            </w:pPr>
-            <w:r/>
-            <w:r>
-              <w:rPr>
-                <w:rFonts w:ascii="Times New Roman" w:hAnsi="Times New Roman"/>
-                <w:sz w:val="24"/>
-              </w:rPr>
-              <w:t>ERROR: permission denied</w:t>
-            </w:r>
-          </w:p>
-        </w:tc>
-        <w:tc>
-          <w:tcPr>
-            <w:tcW w:type="dxa" w:w="2422"/>
-            <w:tcBorders>
-              <w:top w:val="single" w:sz="4" w:color="000000"/>
-              <w:left w:val="single" w:sz="4" w:color="000000"/>
-              <w:bottom w:val="single" w:sz="4" w:color="000000"/>
-              <w:right w:val="single" w:sz="4" w:color="000000"/>
-            </w:tcBorders>
-            <w:vAlign w:val="center"/>
-          </w:tcPr>
-          <w:p>
-            <w:pPr>
-              <w:jc w:val="left"/>
-            </w:pPr>
-            <w:r/>
-            <w:r>
-              <w:rPr>
-                <w:rFonts w:ascii="Times New Roman" w:hAnsi="Times New Roman"/>
-                <w:sz w:val="24"/>
-              </w:rPr>
-              <w:t>Успех</w:t>
-            </w:r>
-          </w:p>
-        </w:tc>
-      </w:tr>
-      <w:tr>
-        <w:tc>
-          <w:tcPr>
-            <w:tcW w:type="dxa" w:w="2422"/>
-            <w:tcBorders>
-              <w:top w:val="single" w:sz="4" w:color="000000"/>
-              <w:left w:val="single" w:sz="4" w:color="000000"/>
-              <w:bottom w:val="single" w:sz="4" w:color="000000"/>
-              <w:right w:val="single" w:sz="4" w:color="000000"/>
-            </w:tcBorders>
-            <w:vAlign w:val="center"/>
-          </w:tcPr>
-          <w:p>
-            <w:pPr>
-              <w:jc w:val="left"/>
-            </w:pPr>
-            <w:r/>
-            <w:r>
-              <w:rPr>
-                <w:rFonts w:ascii="Times New Roman" w:hAnsi="Times New Roman"/>
-                <w:sz w:val="24"/>
-              </w:rPr>
-              <w:t>kuzmina_med</w:t>
-            </w:r>
-          </w:p>
-        </w:tc>
-        <w:tc>
-          <w:tcPr>
-            <w:tcW w:type="dxa" w:w="2422"/>
-            <w:tcBorders>
-              <w:top w:val="single" w:sz="4" w:color="000000"/>
-              <w:left w:val="single" w:sz="4" w:color="000000"/>
-              <w:bottom w:val="single" w:sz="4" w:color="000000"/>
-              <w:right w:val="single" w:sz="4" w:color="000000"/>
-            </w:tcBorders>
-            <w:vAlign w:val="center"/>
-          </w:tcPr>
-          <w:p>
-            <w:pPr>
-              <w:jc w:val="left"/>
-            </w:pPr>
-            <w:r/>
-            <w:r>
-              <w:rPr>
-                <w:rFonts w:ascii="Times New Roman" w:hAnsi="Times New Roman"/>
-                <w:sz w:val="24"/>
-              </w:rPr>
-              <w:t>INSERT INTO medical_records ...;</w:t>
-            </w:r>
-          </w:p>
-        </w:tc>
-        <w:tc>
-          <w:tcPr>
-            <w:tcW w:type="dxa" w:w="2422"/>
-            <w:tcBorders>
-              <w:top w:val="single" w:sz="4" w:color="000000"/>
-              <w:left w:val="single" w:sz="4" w:color="000000"/>
-              <w:bottom w:val="single" w:sz="4" w:color="000000"/>
-              <w:right w:val="single" w:sz="4" w:color="000000"/>
-            </w:tcBorders>
-            <w:vAlign w:val="center"/>
-          </w:tcPr>
-          <w:p>
-            <w:pPr>
-              <w:jc w:val="left"/>
-            </w:pPr>
-            <w:r/>
-            <w:r>
-              <w:rPr>
-                <w:rFonts w:ascii="Times New Roman" w:hAnsi="Times New Roman"/>
-                <w:sz w:val="24"/>
-              </w:rPr>
-              <w:t>Успешная вставка</w:t>
-            </w:r>
-          </w:p>
-        </w:tc>
-        <w:tc>
-          <w:tcPr>
-            <w:tcW w:type="dxa" w:w="2422"/>
-            <w:tcBorders>
-              <w:top w:val="single" w:sz="4" w:color="000000"/>
-              <w:left w:val="single" w:sz="4" w:color="000000"/>
-              <w:bottom w:val="single" w:sz="4" w:color="000000"/>
-              <w:right w:val="single" w:sz="4" w:color="000000"/>
-            </w:tcBorders>
-            <w:vAlign w:val="center"/>
-          </w:tcPr>
-          <w:p>
-            <w:pPr>
-              <w:jc w:val="left"/>
-            </w:pPr>
-            <w:r/>
-            <w:r>
-              <w:rPr>
-                <w:rFonts w:ascii="Times New Roman" w:hAnsi="Times New Roman"/>
-                <w:sz w:val="24"/>
-              </w:rPr>
-              <w:t>Успех</w:t>
-            </w:r>
-          </w:p>
-        </w:tc>
-      </w:tr>
-    </w:tbl>
-    <w:p>
-      <w:pPr>
-        <w:spacing w:before="240" w:after="120"/>
-        <w:jc w:val="center"/>
-      </w:pPr>
-      <w:r>
-        <w:rPr>
-          <w:rFonts w:ascii="Times New Roman" w:hAnsi="Times New Roman"/>
-          <w:b/>
-          <w:sz w:val="32"/>
-        </w:rPr>
-        <w:t>6. Выводы</w:t>
+        <w:t>В ходе выполнения лабораторной работы спроектирована и реализована политика защиты для БД общеобразовательной школы на базе СУБД SQLite и языка Java. Из-за особенностей SQLite (отсутствие собственного механизма GRANT/REVOKE) ограничение доступа реализовано на уровне приложения: аутентификация через таблицу users, разный набор вкладок для каждой роли и горизонтальная фильтрация строк через параметры в SQL-запросах.</w:t>
       </w:r>
     </w:p>
     <w:p>
@@ -3770,23 +3286,7 @@
           <w:i w:val="0"/>
           <w:sz w:val="28"/>
         </w:rPr>
-        <w:t>В ходе выполнения лабораторной работы спроектирована и реализована политика защиты для базы данных общеобразовательной школы. Распределение прав выполнено в двух плоскостях: по таблицам и столбцам (вертикальное разграничение средствами GRANT/REVOKE на уровне колонок) и по записям (горизонтальное разграничение средствами Row-Level Security и представлений).</w:t>
-      </w:r>
-    </w:p>
-    <w:p>
-      <w:pPr>
-        <w:spacing w:line="360" w:lineRule="auto" w:after="0"/>
-        <w:ind w:firstLine="709"/>
-        <w:jc w:val="both"/>
-      </w:pPr>
-      <w:r>
-        <w:rPr>
-          <w:rFonts w:ascii="Times New Roman" w:hAnsi="Times New Roman"/>
-          <w:b w:val="0"/>
-          <w:i w:val="0"/>
-          <w:sz w:val="28"/>
-        </w:rPr>
-        <w:t>Такой подход обеспечивает выполнение принципа минимальных привилегий: каждый пользователь получает доступ только к тем данным, которые необходимы ему для исполнения служебных обязанностей. Директор сохраняет полный контроль над данными, учитель работает только с информацией своих классов, учащийся видит исключительно собственное личное дело и успеваемость, а фельдшер изолирован в пределах медицинских карт. Тем самым достигается требуемый уровень конфиденциальности и целостности данных школьной информационной системы.</w:t>
+        <w:t>Распределение прав выполнено в двух плоскостях: по таблицам и столбцам (показ/сокрытие вкладок и соответствующих SQL-запросов) и по записям (динамическое добавление условий WHERE / JOIN к идентификатору текущего пользователя). Такой подход обеспечивает выполнение принципа минимальных привилегий: директор сохраняет полный контроль над данными, учитель работает только с информацией своих классов, учащийся видит исключительно собственное личное дело и оценки, а фельдшер изолирован в пределах медицинских карт. Корректность политики подтверждена тестовыми прогонами для каждой роли (рисунки 2–6).</w:t>
       </w:r>
     </w:p>
     <w:sectPr>

</xml_diff>